<commit_message>
updates code for preprocess
</commit_message>
<xml_diff>
--- a/documents/FA3 Installation instruction.docx
+++ b/documents/FA3 Installation instruction.docx
@@ -1702,9 +1702,9 @@
         <w:tblLook w:val="04A0" w:firstRow="1" w:lastRow="0" w:firstColumn="1" w:lastColumn="0" w:noHBand="0" w:noVBand="1"/>
       </w:tblPr>
       <w:tblGrid>
-        <w:gridCol w:w="2509"/>
-        <w:gridCol w:w="1561"/>
-        <w:gridCol w:w="5280"/>
+        <w:gridCol w:w="1691"/>
+        <w:gridCol w:w="6121"/>
+        <w:gridCol w:w="1538"/>
       </w:tblGrid>
       <w:tr>
         <w:tc>
@@ -1742,10 +1742,12 @@
         <w:tc>
           <w:tcPr>
             <w:tcW w:w="0" w:type="auto"/>
+            <w:vAlign w:val="center"/>
             <w:hideMark/>
           </w:tcPr>
           <w:p>
             <w:pPr>
+              <w:jc w:val="center"/>
               <w:rPr>
                 <w:rFonts w:ascii="Arial" w:eastAsia="Times New Roman" w:hAnsi="Arial" w:cs="Arial"/>
                 <w:color w:val="1F1F1F"/>
@@ -1833,6 +1835,7 @@
                 <w:bdr w:val="none" w:sz="0" w:space="0" w:color="auto" w:frame="1"/>
                 <w14:ligatures w14:val="none"/>
               </w:rPr>
+              <w:lastRenderedPageBreak/>
               <w:t>Prerequisite Verification</w:t>
             </w:r>
             <w:r>
@@ -1852,10 +1855,12 @@
         <w:tc>
           <w:tcPr>
             <w:tcW w:w="0" w:type="auto"/>
+            <w:vAlign w:val="center"/>
             <w:hideMark/>
           </w:tcPr>
           <w:p>
             <w:pPr>
+              <w:jc w:val="center"/>
               <w:rPr>
                 <w:rFonts w:ascii="Arial" w:eastAsia="Times New Roman" w:hAnsi="Arial" w:cs="Arial"/>
                 <w:color w:val="1F1F1F"/>
@@ -1865,6 +1870,52 @@
                 <w14:ligatures w14:val="none"/>
               </w:rPr>
             </w:pPr>
+            <w:r>
+              <w:rPr>
+                <w:noProof/>
+              </w:rPr>
+              <w:drawing>
+                <wp:inline distT="0" distB="0" distL="0" distR="0" wp14:anchorId="066C4E67" wp14:editId="4579DA5A">
+                  <wp:extent cx="4126675" cy="2346385"/>
+                  <wp:effectExtent l="0" t="0" r="7620" b="0"/>
+                  <wp:docPr id="1385284948" name="Picture 1" descr="A screenshot of a computer&#10;&#10;AI-generated content may be incorrect.">
+                    <a:extLst xmlns:a="http://schemas.openxmlformats.org/drawingml/2006/main">
+                      <a:ext uri="{FF2B5EF4-FFF2-40B4-BE49-F238E27FC236}">
+                        <a16:creationId xmlns:a16="http://schemas.microsoft.com/office/drawing/2014/main" id="{BA221CA2-58A9-420A-8324-8E901BB868AD}"/>
+                      </a:ext>
+                    </a:extLst>
+                  </wp:docPr>
+                  <wp:cNvGraphicFramePr>
+                    <a:graphicFrameLocks xmlns:a="http://schemas.openxmlformats.org/drawingml/2006/main" noChangeAspect="1"/>
+                  </wp:cNvGraphicFramePr>
+                  <a:graphic xmlns:a="http://schemas.openxmlformats.org/drawingml/2006/main">
+                    <a:graphicData uri="http://schemas.openxmlformats.org/drawingml/2006/picture">
+                      <pic:pic xmlns:pic="http://schemas.openxmlformats.org/drawingml/2006/picture">
+                        <pic:nvPicPr>
+                          <pic:cNvPr id="1385284948" name="Picture 1" descr="A screenshot of a computer&#10;&#10;AI-generated content may be incorrect."/>
+                          <pic:cNvPicPr/>
+                        </pic:nvPicPr>
+                        <pic:blipFill>
+                          <a:blip r:embed="rId6"/>
+                          <a:stretch>
+                            <a:fillRect/>
+                          </a:stretch>
+                        </pic:blipFill>
+                        <pic:spPr>
+                          <a:xfrm>
+                            <a:off x="0" y="0"/>
+                            <a:ext cx="4201590" cy="2388981"/>
+                          </a:xfrm>
+                          <a:prstGeom prst="rect">
+                            <a:avLst/>
+                          </a:prstGeom>
+                        </pic:spPr>
+                      </pic:pic>
+                    </a:graphicData>
+                  </a:graphic>
+                </wp:inline>
+              </w:drawing>
+            </w:r>
           </w:p>
         </w:tc>
         <w:tc>
@@ -1966,8 +2017,73 @@
                 <w:bdr w:val="none" w:sz="0" w:space="0" w:color="auto" w:frame="1"/>
                 <w14:ligatures w14:val="none"/>
               </w:rPr>
-              <w:lastRenderedPageBreak/>
-              <w:t>Download &amp; Run EXE</w:t>
+              <w:t>Setup Wizard: Additional Tasks</w:t>
+            </w:r>
+          </w:p>
+        </w:tc>
+        <w:tc>
+          <w:tcPr>
+            <w:tcW w:w="0" w:type="auto"/>
+            <w:vAlign w:val="center"/>
+            <w:hideMark/>
+          </w:tcPr>
+          <w:p>
+            <w:pPr>
+              <w:jc w:val="center"/>
+              <w:rPr>
+                <w:rFonts w:ascii="Arial" w:eastAsia="Times New Roman" w:hAnsi="Arial" w:cs="Arial"/>
+                <w:color w:val="1F1F1F"/>
+                <w:kern w:val="0"/>
+                <w:sz w:val="22"/>
+                <w:szCs w:val="22"/>
+                <w14:ligatures w14:val="none"/>
+              </w:rPr>
+            </w:pPr>
+            <w:r>
+              <w:rPr>
+                <w:noProof/>
+              </w:rPr>
+              <w:drawing>
+                <wp:inline distT="0" distB="0" distL="0" distR="0" wp14:anchorId="4BFC674A" wp14:editId="70EA8437">
+                  <wp:extent cx="2799970" cy="2163613"/>
+                  <wp:effectExtent l="0" t="0" r="635" b="8255"/>
+                  <wp:docPr id="2126572343" name="Picture 1" descr="A screenshot of a computer program&#10;&#10;AI-generated content may be incorrect.">
+                    <a:extLst xmlns:a="http://schemas.openxmlformats.org/drawingml/2006/main">
+                      <a:ext uri="{FF2B5EF4-FFF2-40B4-BE49-F238E27FC236}">
+                        <a16:creationId xmlns:a16="http://schemas.microsoft.com/office/drawing/2014/main" id="{B0AFB75F-BB71-4FD1-9DDD-DBA575AF111A}"/>
+                      </a:ext>
+                    </a:extLst>
+                  </wp:docPr>
+                  <wp:cNvGraphicFramePr>
+                    <a:graphicFrameLocks xmlns:a="http://schemas.openxmlformats.org/drawingml/2006/main" noChangeAspect="1"/>
+                  </wp:cNvGraphicFramePr>
+                  <a:graphic xmlns:a="http://schemas.openxmlformats.org/drawingml/2006/main">
+                    <a:graphicData uri="http://schemas.openxmlformats.org/drawingml/2006/picture">
+                      <pic:pic xmlns:pic="http://schemas.openxmlformats.org/drawingml/2006/picture">
+                        <pic:nvPicPr>
+                          <pic:cNvPr id="2126572343" name="Picture 1" descr="A screenshot of a computer program&#10;&#10;AI-generated content may be incorrect."/>
+                          <pic:cNvPicPr/>
+                        </pic:nvPicPr>
+                        <pic:blipFill>
+                          <a:blip r:embed="rId7"/>
+                          <a:stretch>
+                            <a:fillRect/>
+                          </a:stretch>
+                        </pic:blipFill>
+                        <pic:spPr>
+                          <a:xfrm>
+                            <a:off x="0" y="0"/>
+                            <a:ext cx="2820856" cy="2179752"/>
+                          </a:xfrm>
+                          <a:prstGeom prst="rect">
+                            <a:avLst/>
+                          </a:prstGeom>
+                        </pic:spPr>
+                      </pic:pic>
+                    </a:graphicData>
+                  </a:graphic>
+                </wp:inline>
+              </w:drawing>
             </w:r>
           </w:p>
         </w:tc>
@@ -1987,24 +2103,6 @@
                 <w14:ligatures w14:val="none"/>
               </w:rPr>
             </w:pPr>
-          </w:p>
-        </w:tc>
-        <w:tc>
-          <w:tcPr>
-            <w:tcW w:w="0" w:type="auto"/>
-            <w:hideMark/>
-          </w:tcPr>
-          <w:p>
-            <w:pPr>
-              <w:rPr>
-                <w:rFonts w:ascii="Arial" w:eastAsia="Times New Roman" w:hAnsi="Arial" w:cs="Arial"/>
-                <w:color w:val="1F1F1F"/>
-                <w:kern w:val="0"/>
-                <w:sz w:val="22"/>
-                <w:szCs w:val="22"/>
-                <w14:ligatures w14:val="none"/>
-              </w:rPr>
-            </w:pPr>
             <w:r>
               <w:rPr>
                 <w:rFonts w:ascii="Arial" w:eastAsia="Times New Roman" w:hAnsi="Arial" w:cs="Arial"/>
@@ -2017,19 +2115,61 @@
                 <w:bdr w:val="none" w:sz="0" w:space="0" w:color="auto" w:frame="1"/>
                 <w14:ligatures w14:val="none"/>
               </w:rPr>
-              <w:t>Figure 2.1: Locating the Installer.</w:t>
-            </w:r>
-            <w:r>
-              <w:rPr>
-                <w:rFonts w:ascii="Arial" w:eastAsia="Times New Roman" w:hAnsi="Arial" w:cs="Arial"/>
-                <w:color w:val="1F1F1F"/>
-                <w:kern w:val="0"/>
-                <w:sz w:val="22"/>
-                <w:szCs w:val="22"/>
-                <w:bdr w:val="none" w:sz="0" w:space="0" w:color="auto" w:frame="1"/>
-                <w14:ligatures w14:val="none"/>
-              </w:rPr>
-              <w:t xml:space="preserve"> Search for and double-click the downloaded Fastaptamer3 installer file</w:t>
+              <w:t>Figure 2.</w:t>
+            </w:r>
+            <w:r>
+              <w:rPr>
+                <w:rFonts w:ascii="Arial" w:eastAsia="DengXian" w:hAnsi="Arial" w:cs="Arial" w:hint="eastAsia"/>
+                <w:b/>
+                <w:bCs/>
+                <w:color w:val="1F1F1F"/>
+                <w:kern w:val="0"/>
+                <w:sz w:val="22"/>
+                <w:szCs w:val="22"/>
+                <w:bdr w:val="none" w:sz="0" w:space="0" w:color="auto" w:frame="1"/>
+                <w14:ligatures w14:val="none"/>
+              </w:rPr>
+              <w:t>1</w:t>
+            </w:r>
+            <w:r>
+              <w:rPr>
+                <w:rFonts w:ascii="Arial" w:eastAsia="Times New Roman" w:hAnsi="Arial" w:cs="Arial"/>
+                <w:b/>
+                <w:bCs/>
+                <w:color w:val="1F1F1F"/>
+                <w:kern w:val="0"/>
+                <w:sz w:val="22"/>
+                <w:szCs w:val="22"/>
+                <w:bdr w:val="none" w:sz="0" w:space="0" w:color="auto" w:frame="1"/>
+                <w14:ligatures w14:val="none"/>
+              </w:rPr>
+              <w:t>: Select Additional Tasks.</w:t>
+            </w:r>
+            <w:r>
+              <w:rPr>
+                <w:rFonts w:ascii="Arial" w:eastAsia="Times New Roman" w:hAnsi="Arial" w:cs="Arial"/>
+                <w:color w:val="1F1F1F"/>
+                <w:kern w:val="0"/>
+                <w:sz w:val="22"/>
+                <w:szCs w:val="22"/>
+                <w:bdr w:val="none" w:sz="0" w:space="0" w:color="auto" w:frame="1"/>
+                <w14:ligatures w14:val="none"/>
+              </w:rPr>
+              <w:t xml:space="preserve"> Choose whether to create a desktop shortcut and click </w:t>
+            </w:r>
+            <w:r>
+              <w:rPr>
+                <w:rFonts w:ascii="Arial" w:eastAsia="Times New Roman" w:hAnsi="Arial" w:cs="Arial"/>
+                <w:b/>
+                <w:bCs/>
+                <w:color w:val="1F1F1F"/>
+                <w:kern w:val="0"/>
+                <w:sz w:val="22"/>
+                <w:szCs w:val="22"/>
+                <w:bdr w:val="none" w:sz="0" w:space="0" w:color="auto" w:frame="1"/>
+                <w14:ligatures w14:val="none"/>
+              </w:rPr>
+              <w:t>Next</w:t>
             </w:r>
             <w:r>
               <w:rPr>
@@ -2042,7 +2182,7 @@
                 <w:vertAlign w:val="superscript"/>
                 <w14:ligatures w14:val="none"/>
               </w:rPr>
-              <w:t>4</w:t>
+              <w:t>6</w:t>
             </w:r>
             <w:r>
               <w:rPr>
@@ -2088,7 +2228,73 @@
                 <w:bdr w:val="none" w:sz="0" w:space="0" w:color="auto" w:frame="1"/>
                 <w14:ligatures w14:val="none"/>
               </w:rPr>
-              <w:t>Setup Wizard: Additional Tasks</w:t>
+              <w:t>Setup Wizard: Ready to Install</w:t>
+            </w:r>
+          </w:p>
+        </w:tc>
+        <w:tc>
+          <w:tcPr>
+            <w:tcW w:w="0" w:type="auto"/>
+            <w:vAlign w:val="center"/>
+            <w:hideMark/>
+          </w:tcPr>
+          <w:p>
+            <w:pPr>
+              <w:jc w:val="center"/>
+              <w:rPr>
+                <w:rFonts w:ascii="Arial" w:eastAsia="Times New Roman" w:hAnsi="Arial" w:cs="Arial"/>
+                <w:color w:val="1F1F1F"/>
+                <w:kern w:val="0"/>
+                <w:sz w:val="22"/>
+                <w:szCs w:val="22"/>
+                <w14:ligatures w14:val="none"/>
+              </w:rPr>
+            </w:pPr>
+            <w:r>
+              <w:rPr>
+                <w:noProof/>
+              </w:rPr>
+              <w:drawing>
+                <wp:inline distT="0" distB="0" distL="0" distR="0" wp14:anchorId="3BF8BF5F" wp14:editId="461F7DCA">
+                  <wp:extent cx="3237422" cy="2495738"/>
+                  <wp:effectExtent l="0" t="0" r="1270" b="0"/>
+                  <wp:docPr id="1359934859" name="Picture 1" descr="A screenshot of a computer&#10;&#10;AI-generated content may be incorrect.">
+                    <a:extLst xmlns:a="http://schemas.openxmlformats.org/drawingml/2006/main">
+                      <a:ext uri="{FF2B5EF4-FFF2-40B4-BE49-F238E27FC236}">
+                        <a16:creationId xmlns:a16="http://schemas.microsoft.com/office/drawing/2014/main" id="{23936169-E3B5-4907-B80A-46D3C0E488C6}"/>
+                      </a:ext>
+                    </a:extLst>
+                  </wp:docPr>
+                  <wp:cNvGraphicFramePr>
+                    <a:graphicFrameLocks xmlns:a="http://schemas.openxmlformats.org/drawingml/2006/main" noChangeAspect="1"/>
+                  </wp:cNvGraphicFramePr>
+                  <a:graphic xmlns:a="http://schemas.openxmlformats.org/drawingml/2006/main">
+                    <a:graphicData uri="http://schemas.openxmlformats.org/drawingml/2006/picture">
+                      <pic:pic xmlns:pic="http://schemas.openxmlformats.org/drawingml/2006/picture">
+                        <pic:nvPicPr>
+                          <pic:cNvPr id="1359934859" name="Picture 1" descr="A screenshot of a computer&#10;&#10;AI-generated content may be incorrect."/>
+                          <pic:cNvPicPr/>
+                        </pic:nvPicPr>
+                        <pic:blipFill>
+                          <a:blip r:embed="rId8"/>
+                          <a:stretch>
+                            <a:fillRect/>
+                          </a:stretch>
+                        </pic:blipFill>
+                        <pic:spPr>
+                          <a:xfrm>
+                            <a:off x="0" y="0"/>
+                            <a:ext cx="3240225" cy="2497899"/>
+                          </a:xfrm>
+                          <a:prstGeom prst="rect">
+                            <a:avLst/>
+                          </a:prstGeom>
+                        </pic:spPr>
+                      </pic:pic>
+                    </a:graphicData>
+                  </a:graphic>
+                </wp:inline>
+              </w:drawing>
             </w:r>
           </w:p>
         </w:tc>
@@ -2108,24 +2314,6 @@
                 <w14:ligatures w14:val="none"/>
               </w:rPr>
             </w:pPr>
-          </w:p>
-        </w:tc>
-        <w:tc>
-          <w:tcPr>
-            <w:tcW w:w="0" w:type="auto"/>
-            <w:hideMark/>
-          </w:tcPr>
-          <w:p>
-            <w:pPr>
-              <w:rPr>
-                <w:rFonts w:ascii="Arial" w:eastAsia="Times New Roman" w:hAnsi="Arial" w:cs="Arial"/>
-                <w:color w:val="1F1F1F"/>
-                <w:kern w:val="0"/>
-                <w:sz w:val="22"/>
-                <w:szCs w:val="22"/>
-                <w14:ligatures w14:val="none"/>
-              </w:rPr>
-            </w:pPr>
             <w:r>
               <w:rPr>
                 <w:rFonts w:ascii="Arial" w:eastAsia="Times New Roman" w:hAnsi="Arial" w:cs="Arial"/>
@@ -2138,23 +2326,11 @@
                 <w:bdr w:val="none" w:sz="0" w:space="0" w:color="auto" w:frame="1"/>
                 <w14:ligatures w14:val="none"/>
               </w:rPr>
-              <w:t>Figure 2.2: Select Additional Tasks.</w:t>
-            </w:r>
-            <w:r>
-              <w:rPr>
-                <w:rFonts w:ascii="Arial" w:eastAsia="Times New Roman" w:hAnsi="Arial" w:cs="Arial"/>
-                <w:color w:val="1F1F1F"/>
-                <w:kern w:val="0"/>
-                <w:sz w:val="22"/>
-                <w:szCs w:val="22"/>
-                <w:bdr w:val="none" w:sz="0" w:space="0" w:color="auto" w:frame="1"/>
-                <w14:ligatures w14:val="none"/>
-              </w:rPr>
-              <w:t xml:space="preserve"> Choose whether to create a desktop shortcut and click </w:t>
-            </w:r>
-            <w:r>
-              <w:rPr>
-                <w:rFonts w:ascii="Arial" w:eastAsia="Times New Roman" w:hAnsi="Arial" w:cs="Arial"/>
+              <w:t>Figure 2.</w:t>
+            </w:r>
+            <w:r>
+              <w:rPr>
+                <w:rFonts w:ascii="Arial" w:eastAsia="DengXian" w:hAnsi="Arial" w:cs="Arial" w:hint="eastAsia"/>
                 <w:b/>
                 <w:bCs/>
                 <w:color w:val="1F1F1F"/>
@@ -2164,7 +2340,59 @@
                 <w:bdr w:val="none" w:sz="0" w:space="0" w:color="auto" w:frame="1"/>
                 <w14:ligatures w14:val="none"/>
               </w:rPr>
-              <w:t>Next</w:t>
+              <w:t>2</w:t>
+            </w:r>
+            <w:r>
+              <w:rPr>
+                <w:rFonts w:ascii="Arial" w:eastAsia="Times New Roman" w:hAnsi="Arial" w:cs="Arial"/>
+                <w:b/>
+                <w:bCs/>
+                <w:color w:val="1F1F1F"/>
+                <w:kern w:val="0"/>
+                <w:sz w:val="22"/>
+                <w:szCs w:val="22"/>
+                <w:bdr w:val="none" w:sz="0" w:space="0" w:color="auto" w:frame="1"/>
+                <w14:ligatures w14:val="none"/>
+              </w:rPr>
+              <w:t>: Ready to Install.</w:t>
+            </w:r>
+            <w:r>
+              <w:rPr>
+                <w:rFonts w:ascii="Arial" w:eastAsia="Times New Roman" w:hAnsi="Arial" w:cs="Arial"/>
+                <w:color w:val="1F1F1F"/>
+                <w:kern w:val="0"/>
+                <w:sz w:val="22"/>
+                <w:szCs w:val="22"/>
+                <w:bdr w:val="none" w:sz="0" w:space="0" w:color="auto" w:frame="1"/>
+                <w14:ligatures w14:val="none"/>
+              </w:rPr>
+              <w:t xml:space="preserve"> Click </w:t>
+            </w:r>
+            <w:r>
+              <w:rPr>
+                <w:rFonts w:ascii="Arial" w:eastAsia="Times New Roman" w:hAnsi="Arial" w:cs="Arial"/>
+                <w:b/>
+                <w:bCs/>
+                <w:color w:val="1F1F1F"/>
+                <w:kern w:val="0"/>
+                <w:sz w:val="22"/>
+                <w:szCs w:val="22"/>
+                <w:bdr w:val="none" w:sz="0" w:space="0" w:color="auto" w:frame="1"/>
+                <w14:ligatures w14:val="none"/>
+              </w:rPr>
+              <w:t>Install</w:t>
+            </w:r>
+            <w:r>
+              <w:rPr>
+                <w:rFonts w:ascii="Arial" w:eastAsia="Times New Roman" w:hAnsi="Arial" w:cs="Arial"/>
+                <w:color w:val="1F1F1F"/>
+                <w:kern w:val="0"/>
+                <w:sz w:val="22"/>
+                <w:szCs w:val="22"/>
+                <w:bdr w:val="none" w:sz="0" w:space="0" w:color="auto" w:frame="1"/>
+                <w14:ligatures w14:val="none"/>
+              </w:rPr>
+              <w:t xml:space="preserve"> to proceed with the setup</w:t>
             </w:r>
             <w:r>
               <w:rPr>
@@ -2177,7 +2405,7 @@
                 <w:vertAlign w:val="superscript"/>
                 <w14:ligatures w14:val="none"/>
               </w:rPr>
-              <w:t>6</w:t>
+              <w:t>8</w:t>
             </w:r>
             <w:r>
               <w:rPr>
@@ -2223,7 +2451,74 @@
                 <w:bdr w:val="none" w:sz="0" w:space="0" w:color="auto" w:frame="1"/>
                 <w14:ligatures w14:val="none"/>
               </w:rPr>
-              <w:t>Setup Wizard: Ready to Install</w:t>
+              <w:lastRenderedPageBreak/>
+              <w:t>Setup Wizard: Completion</w:t>
+            </w:r>
+          </w:p>
+        </w:tc>
+        <w:tc>
+          <w:tcPr>
+            <w:tcW w:w="0" w:type="auto"/>
+            <w:vAlign w:val="center"/>
+            <w:hideMark/>
+          </w:tcPr>
+          <w:p>
+            <w:pPr>
+              <w:jc w:val="center"/>
+              <w:rPr>
+                <w:rFonts w:ascii="Arial" w:eastAsia="Times New Roman" w:hAnsi="Arial" w:cs="Arial"/>
+                <w:color w:val="1F1F1F"/>
+                <w:kern w:val="0"/>
+                <w:sz w:val="22"/>
+                <w:szCs w:val="22"/>
+                <w14:ligatures w14:val="none"/>
+              </w:rPr>
+            </w:pPr>
+            <w:r>
+              <w:rPr>
+                <w:noProof/>
+              </w:rPr>
+              <w:drawing>
+                <wp:inline distT="0" distB="0" distL="0" distR="0" wp14:anchorId="01F2D5E7" wp14:editId="737CF4EC">
+                  <wp:extent cx="3110720" cy="2411973"/>
+                  <wp:effectExtent l="0" t="0" r="0" b="7620"/>
+                  <wp:docPr id="1599413771" name="Picture 1" descr="A screen shot of a computer&#10;&#10;AI-generated content may be incorrect.">
+                    <a:extLst xmlns:a="http://schemas.openxmlformats.org/drawingml/2006/main">
+                      <a:ext uri="{FF2B5EF4-FFF2-40B4-BE49-F238E27FC236}">
+                        <a16:creationId xmlns:a16="http://schemas.microsoft.com/office/drawing/2014/main" id="{1B10FDED-518F-4F8E-AD6A-1ADEE351CBB0}"/>
+                      </a:ext>
+                    </a:extLst>
+                  </wp:docPr>
+                  <wp:cNvGraphicFramePr>
+                    <a:graphicFrameLocks xmlns:a="http://schemas.openxmlformats.org/drawingml/2006/main" noChangeAspect="1"/>
+                  </wp:cNvGraphicFramePr>
+                  <a:graphic xmlns:a="http://schemas.openxmlformats.org/drawingml/2006/main">
+                    <a:graphicData uri="http://schemas.openxmlformats.org/drawingml/2006/picture">
+                      <pic:pic xmlns:pic="http://schemas.openxmlformats.org/drawingml/2006/picture">
+                        <pic:nvPicPr>
+                          <pic:cNvPr id="1599413771" name="Picture 1" descr="A screen shot of a computer&#10;&#10;AI-generated content may be incorrect."/>
+                          <pic:cNvPicPr/>
+                        </pic:nvPicPr>
+                        <pic:blipFill>
+                          <a:blip r:embed="rId9"/>
+                          <a:stretch>
+                            <a:fillRect/>
+                          </a:stretch>
+                        </pic:blipFill>
+                        <pic:spPr>
+                          <a:xfrm>
+                            <a:off x="0" y="0"/>
+                            <a:ext cx="3124023" cy="2422288"/>
+                          </a:xfrm>
+                          <a:prstGeom prst="rect">
+                            <a:avLst/>
+                          </a:prstGeom>
+                        </pic:spPr>
+                      </pic:pic>
+                    </a:graphicData>
+                  </a:graphic>
+                </wp:inline>
+              </w:drawing>
             </w:r>
           </w:p>
         </w:tc>
@@ -2243,24 +2538,6 @@
                 <w14:ligatures w14:val="none"/>
               </w:rPr>
             </w:pPr>
-          </w:p>
-        </w:tc>
-        <w:tc>
-          <w:tcPr>
-            <w:tcW w:w="0" w:type="auto"/>
-            <w:hideMark/>
-          </w:tcPr>
-          <w:p>
-            <w:pPr>
-              <w:rPr>
-                <w:rFonts w:ascii="Arial" w:eastAsia="Times New Roman" w:hAnsi="Arial" w:cs="Arial"/>
-                <w:color w:val="1F1F1F"/>
-                <w:kern w:val="0"/>
-                <w:sz w:val="22"/>
-                <w:szCs w:val="22"/>
-                <w14:ligatures w14:val="none"/>
-              </w:rPr>
-            </w:pPr>
             <w:r>
               <w:rPr>
                 <w:rFonts w:ascii="Arial" w:eastAsia="Times New Roman" w:hAnsi="Arial" w:cs="Arial"/>
@@ -2273,23 +2550,11 @@
                 <w:bdr w:val="none" w:sz="0" w:space="0" w:color="auto" w:frame="1"/>
                 <w14:ligatures w14:val="none"/>
               </w:rPr>
-              <w:t>Figure 2.3: Ready to Install.</w:t>
-            </w:r>
-            <w:r>
-              <w:rPr>
-                <w:rFonts w:ascii="Arial" w:eastAsia="Times New Roman" w:hAnsi="Arial" w:cs="Arial"/>
-                <w:color w:val="1F1F1F"/>
-                <w:kern w:val="0"/>
-                <w:sz w:val="22"/>
-                <w:szCs w:val="22"/>
-                <w:bdr w:val="none" w:sz="0" w:space="0" w:color="auto" w:frame="1"/>
-                <w14:ligatures w14:val="none"/>
-              </w:rPr>
-              <w:t xml:space="preserve"> Click </w:t>
-            </w:r>
-            <w:r>
-              <w:rPr>
-                <w:rFonts w:ascii="Arial" w:eastAsia="Times New Roman" w:hAnsi="Arial" w:cs="Arial"/>
+              <w:t>Figure 2.</w:t>
+            </w:r>
+            <w:r>
+              <w:rPr>
+                <w:rFonts w:ascii="Arial" w:eastAsia="DengXian" w:hAnsi="Arial" w:cs="Arial" w:hint="eastAsia"/>
                 <w:b/>
                 <w:bCs/>
                 <w:color w:val="1F1F1F"/>
@@ -2299,19 +2564,59 @@
                 <w:bdr w:val="none" w:sz="0" w:space="0" w:color="auto" w:frame="1"/>
                 <w14:ligatures w14:val="none"/>
               </w:rPr>
-              <w:t>Install</w:t>
-            </w:r>
-            <w:r>
-              <w:rPr>
-                <w:rFonts w:ascii="Arial" w:eastAsia="Times New Roman" w:hAnsi="Arial" w:cs="Arial"/>
-                <w:color w:val="1F1F1F"/>
-                <w:kern w:val="0"/>
-                <w:sz w:val="22"/>
-                <w:szCs w:val="22"/>
-                <w:bdr w:val="none" w:sz="0" w:space="0" w:color="auto" w:frame="1"/>
-                <w14:ligatures w14:val="none"/>
-              </w:rPr>
-              <w:t xml:space="preserve"> to proceed with the setup</w:t>
+              <w:t>3</w:t>
+            </w:r>
+            <w:r>
+              <w:rPr>
+                <w:rFonts w:ascii="Arial" w:eastAsia="Times New Roman" w:hAnsi="Arial" w:cs="Arial"/>
+                <w:b/>
+                <w:bCs/>
+                <w:color w:val="1F1F1F"/>
+                <w:kern w:val="0"/>
+                <w:sz w:val="22"/>
+                <w:szCs w:val="22"/>
+                <w:bdr w:val="none" w:sz="0" w:space="0" w:color="auto" w:frame="1"/>
+                <w14:ligatures w14:val="none"/>
+              </w:rPr>
+              <w:t>: Setup Complete.</w:t>
+            </w:r>
+            <w:r>
+              <w:rPr>
+                <w:rFonts w:ascii="Arial" w:eastAsia="Times New Roman" w:hAnsi="Arial" w:cs="Arial"/>
+                <w:color w:val="1F1F1F"/>
+                <w:kern w:val="0"/>
+                <w:sz w:val="22"/>
+                <w:szCs w:val="22"/>
+                <w:bdr w:val="none" w:sz="0" w:space="0" w:color="auto" w:frame="1"/>
+                <w14:ligatures w14:val="none"/>
+              </w:rPr>
+              <w:t xml:space="preserve"> Click </w:t>
+            </w:r>
+            <w:r>
+              <w:rPr>
+                <w:rFonts w:ascii="Arial" w:eastAsia="Times New Roman" w:hAnsi="Arial" w:cs="Arial"/>
+                <w:b/>
+                <w:bCs/>
+                <w:color w:val="1F1F1F"/>
+                <w:kern w:val="0"/>
+                <w:sz w:val="22"/>
+                <w:szCs w:val="22"/>
+                <w:bdr w:val="none" w:sz="0" w:space="0" w:color="auto" w:frame="1"/>
+                <w14:ligatures w14:val="none"/>
+              </w:rPr>
+              <w:t>Finish</w:t>
+            </w:r>
+            <w:r>
+              <w:rPr>
+                <w:rFonts w:ascii="Arial" w:eastAsia="Times New Roman" w:hAnsi="Arial" w:cs="Arial"/>
+                <w:color w:val="1F1F1F"/>
+                <w:kern w:val="0"/>
+                <w:sz w:val="22"/>
+                <w:szCs w:val="22"/>
+                <w:bdr w:val="none" w:sz="0" w:space="0" w:color="auto" w:frame="1"/>
+                <w14:ligatures w14:val="none"/>
+              </w:rPr>
+              <w:t xml:space="preserve"> to exit the setup wizard, optionally launching the application immediately</w:t>
             </w:r>
             <w:r>
               <w:rPr>
@@ -2324,7 +2629,7 @@
                 <w:vertAlign w:val="superscript"/>
                 <w14:ligatures w14:val="none"/>
               </w:rPr>
-              <w:t>8</w:t>
+              <w:t>10</w:t>
             </w:r>
             <w:r>
               <w:rPr>
@@ -2370,7 +2675,166 @@
                 <w:bdr w:val="none" w:sz="0" w:space="0" w:color="auto" w:frame="1"/>
                 <w14:ligatures w14:val="none"/>
               </w:rPr>
-              <w:t>Setup Wizard: Completion</w:t>
+              <w:t>Launch Icon</w:t>
+            </w:r>
+            <w:r>
+              <w:rPr>
+                <w:rFonts w:ascii="Arial" w:eastAsia="Times New Roman" w:hAnsi="Arial" w:cs="Arial"/>
+                <w:color w:val="1F1F1F"/>
+                <w:kern w:val="0"/>
+                <w:sz w:val="22"/>
+                <w:szCs w:val="22"/>
+                <w:bdr w:val="none" w:sz="0" w:space="0" w:color="auto" w:frame="1"/>
+                <w14:ligatures w14:val="none"/>
+              </w:rPr>
+              <w:t xml:space="preserve"> (Optional/For reference)</w:t>
+            </w:r>
+          </w:p>
+        </w:tc>
+        <w:tc>
+          <w:tcPr>
+            <w:tcW w:w="0" w:type="auto"/>
+            <w:vAlign w:val="center"/>
+            <w:hideMark/>
+          </w:tcPr>
+          <w:p>
+            <w:pPr>
+              <w:jc w:val="center"/>
+              <w:rPr>
+                <w:rFonts w:ascii="Arial" w:eastAsia="DengXian" w:hAnsi="Arial" w:cs="Arial"/>
+                <w:color w:val="1F1F1F"/>
+                <w:kern w:val="0"/>
+                <w:sz w:val="22"/>
+                <w:szCs w:val="22"/>
+                <w14:ligatures w14:val="none"/>
+              </w:rPr>
+            </w:pPr>
+            <w:r>
+              <w:rPr>
+                <w:noProof/>
+              </w:rPr>
+              <w:drawing>
+                <wp:inline distT="0" distB="0" distL="0" distR="0" wp14:anchorId="5C97964E" wp14:editId="3E6E12CE">
+                  <wp:extent cx="943107" cy="647790"/>
+                  <wp:effectExtent l="0" t="0" r="9525" b="0"/>
+                  <wp:docPr id="758618981" name="Picture 1" descr="A screen shot of a computer&#10;&#10;AI-generated content may be incorrect.">
+                    <a:extLst xmlns:a="http://schemas.openxmlformats.org/drawingml/2006/main">
+                      <a:ext uri="{FF2B5EF4-FFF2-40B4-BE49-F238E27FC236}">
+                        <a16:creationId xmlns:a16="http://schemas.microsoft.com/office/drawing/2014/main" id="{64C7DC11-4BA5-4B7A-BAE4-AB5591F18795}"/>
+                      </a:ext>
+                    </a:extLst>
+                  </wp:docPr>
+                  <wp:cNvGraphicFramePr>
+                    <a:graphicFrameLocks xmlns:a="http://schemas.openxmlformats.org/drawingml/2006/main" noChangeAspect="1"/>
+                  </wp:cNvGraphicFramePr>
+                  <a:graphic xmlns:a="http://schemas.openxmlformats.org/drawingml/2006/main">
+                    <a:graphicData uri="http://schemas.openxmlformats.org/drawingml/2006/picture">
+                      <pic:pic xmlns:pic="http://schemas.openxmlformats.org/drawingml/2006/picture">
+                        <pic:nvPicPr>
+                          <pic:cNvPr id="758618981" name="Picture 1" descr="A screen shot of a computer&#10;&#10;AI-generated content may be incorrect."/>
+                          <pic:cNvPicPr/>
+                        </pic:nvPicPr>
+                        <pic:blipFill>
+                          <a:blip r:embed="rId10"/>
+                          <a:stretch>
+                            <a:fillRect/>
+                          </a:stretch>
+                        </pic:blipFill>
+                        <pic:spPr>
+                          <a:xfrm>
+                            <a:off x="0" y="0"/>
+                            <a:ext cx="943107" cy="647790"/>
+                          </a:xfrm>
+                          <a:prstGeom prst="rect">
+                            <a:avLst/>
+                          </a:prstGeom>
+                        </pic:spPr>
+                      </pic:pic>
+                    </a:graphicData>
+                  </a:graphic>
+                </wp:inline>
+              </w:drawing>
+            </w:r>
+          </w:p>
+          <w:p>
+            <w:pPr>
+              <w:jc w:val="center"/>
+              <w:rPr>
+                <w:rFonts w:ascii="Arial" w:eastAsia="DengXian" w:hAnsi="Arial" w:cs="Arial"/>
+                <w:color w:val="1F1F1F"/>
+                <w:kern w:val="0"/>
+                <w:sz w:val="22"/>
+                <w:szCs w:val="22"/>
+                <w14:ligatures w14:val="none"/>
+              </w:rPr>
+            </w:pPr>
+          </w:p>
+          <w:p>
+            <w:pPr>
+              <w:jc w:val="center"/>
+              <w:rPr>
+                <w:rFonts w:ascii="Arial" w:eastAsia="DengXian" w:hAnsi="Arial" w:cs="Arial" w:hint="eastAsia"/>
+                <w:color w:val="1F1F1F"/>
+                <w:kern w:val="0"/>
+                <w:sz w:val="22"/>
+                <w:szCs w:val="22"/>
+                <w14:ligatures w14:val="none"/>
+              </w:rPr>
+            </w:pPr>
+            <w:r>
+              <w:rPr>
+                <w:noProof/>
+              </w:rPr>
+              <w:drawing>
+                <wp:inline distT="0" distB="0" distL="0" distR="0" wp14:anchorId="0324F5A1" wp14:editId="5398B490">
+                  <wp:extent cx="3260785" cy="1231033"/>
+                  <wp:effectExtent l="0" t="0" r="0" b="7620"/>
+                  <wp:docPr id="1429504680" name="Picture 1" descr="A screenshot of a computer&#10;&#10;AI-generated content may be incorrect.">
+                    <a:extLst xmlns:a="http://schemas.openxmlformats.org/drawingml/2006/main">
+                      <a:ext uri="{FF2B5EF4-FFF2-40B4-BE49-F238E27FC236}">
+                        <a16:creationId xmlns:a16="http://schemas.microsoft.com/office/drawing/2014/main" id="{7E1995AD-3814-42E4-86DD-9C6A1B17C7A8}"/>
+                      </a:ext>
+                    </a:extLst>
+                  </wp:docPr>
+                  <wp:cNvGraphicFramePr>
+                    <a:graphicFrameLocks xmlns:a="http://schemas.openxmlformats.org/drawingml/2006/main" noChangeAspect="1"/>
+                  </wp:cNvGraphicFramePr>
+                  <a:graphic xmlns:a="http://schemas.openxmlformats.org/drawingml/2006/main">
+                    <a:graphicData uri="http://schemas.openxmlformats.org/drawingml/2006/picture">
+                      <pic:pic xmlns:pic="http://schemas.openxmlformats.org/drawingml/2006/picture">
+                        <pic:nvPicPr>
+                          <pic:cNvPr id="1429504680" name="Picture 1" descr="A screenshot of a computer&#10;&#10;AI-generated content may be incorrect."/>
+                          <pic:cNvPicPr/>
+                        </pic:nvPicPr>
+                        <pic:blipFill rotWithShape="1">
+                          <a:blip r:embed="rId11"/>
+                          <a:srcRect l="-160" t="9889" r="15064"/>
+                          <a:stretch>
+                            <a:fillRect/>
+                          </a:stretch>
+                        </pic:blipFill>
+                        <pic:spPr bwMode="auto">
+                          <a:xfrm>
+                            <a:off x="0" y="0"/>
+                            <a:ext cx="3273270" cy="1235747"/>
+                          </a:xfrm>
+                          <a:prstGeom prst="rect">
+                            <a:avLst/>
+                          </a:prstGeom>
+                          <a:ln>
+                            <a:noFill/>
+                          </a:ln>
+                          <a:extLst>
+                            <a:ext uri="{53640926-AAD7-44D8-BBD7-CCE9431645EC}">
+                              <a14:shadowObscured xmlns:a14="http://schemas.microsoft.com/office/drawing/2010/main"/>
+                            </a:ext>
+                          </a:extLst>
+                        </pic:spPr>
+                      </pic:pic>
+                    </a:graphicData>
+                  </a:graphic>
+                </wp:inline>
+              </w:drawing>
             </w:r>
           </w:p>
         </w:tc>
@@ -2390,24 +2854,6 @@
                 <w14:ligatures w14:val="none"/>
               </w:rPr>
             </w:pPr>
-          </w:p>
-        </w:tc>
-        <w:tc>
-          <w:tcPr>
-            <w:tcW w:w="0" w:type="auto"/>
-            <w:hideMark/>
-          </w:tcPr>
-          <w:p>
-            <w:pPr>
-              <w:rPr>
-                <w:rFonts w:ascii="Arial" w:eastAsia="Times New Roman" w:hAnsi="Arial" w:cs="Arial"/>
-                <w:color w:val="1F1F1F"/>
-                <w:kern w:val="0"/>
-                <w:sz w:val="22"/>
-                <w:szCs w:val="22"/>
-                <w14:ligatures w14:val="none"/>
-              </w:rPr>
-            </w:pPr>
             <w:r>
               <w:rPr>
                 <w:rFonts w:ascii="Arial" w:eastAsia="Times New Roman" w:hAnsi="Arial" w:cs="Arial"/>
@@ -2420,23 +2866,11 @@
                 <w:bdr w:val="none" w:sz="0" w:space="0" w:color="auto" w:frame="1"/>
                 <w14:ligatures w14:val="none"/>
               </w:rPr>
-              <w:t>Figure 2.4: Setup Complete.</w:t>
-            </w:r>
-            <w:r>
-              <w:rPr>
-                <w:rFonts w:ascii="Arial" w:eastAsia="Times New Roman" w:hAnsi="Arial" w:cs="Arial"/>
-                <w:color w:val="1F1F1F"/>
-                <w:kern w:val="0"/>
-                <w:sz w:val="22"/>
-                <w:szCs w:val="22"/>
-                <w:bdr w:val="none" w:sz="0" w:space="0" w:color="auto" w:frame="1"/>
-                <w14:ligatures w14:val="none"/>
-              </w:rPr>
-              <w:t xml:space="preserve"> Click </w:t>
-            </w:r>
-            <w:r>
-              <w:rPr>
-                <w:rFonts w:ascii="Arial" w:eastAsia="Times New Roman" w:hAnsi="Arial" w:cs="Arial"/>
+              <w:t>Figure 2.</w:t>
+            </w:r>
+            <w:r>
+              <w:rPr>
+                <w:rFonts w:ascii="Arial" w:eastAsia="DengXian" w:hAnsi="Arial" w:cs="Arial" w:hint="eastAsia"/>
                 <w:b/>
                 <w:bCs/>
                 <w:color w:val="1F1F1F"/>
@@ -2446,19 +2880,21 @@
                 <w:bdr w:val="none" w:sz="0" w:space="0" w:color="auto" w:frame="1"/>
                 <w14:ligatures w14:val="none"/>
               </w:rPr>
-              <w:t>Finish</w:t>
-            </w:r>
-            <w:r>
-              <w:rPr>
-                <w:rFonts w:ascii="Arial" w:eastAsia="Times New Roman" w:hAnsi="Arial" w:cs="Arial"/>
-                <w:color w:val="1F1F1F"/>
-                <w:kern w:val="0"/>
-                <w:sz w:val="22"/>
-                <w:szCs w:val="22"/>
-                <w:bdr w:val="none" w:sz="0" w:space="0" w:color="auto" w:frame="1"/>
-                <w14:ligatures w14:val="none"/>
-              </w:rPr>
-              <w:t xml:space="preserve"> to exit the setup wizard, optionally launching the application immediately</w:t>
+              <w:t>4</w:t>
+            </w:r>
+            <w:r>
+              <w:rPr>
+                <w:rFonts w:ascii="Arial" w:eastAsia="Times New Roman" w:hAnsi="Arial" w:cs="Arial"/>
+                <w:b/>
+                <w:bCs/>
+                <w:color w:val="1F1F1F"/>
+                <w:kern w:val="0"/>
+                <w:sz w:val="22"/>
+                <w:szCs w:val="22"/>
+                <w:bdr w:val="none" w:sz="0" w:space="0" w:color="auto" w:frame="1"/>
+                <w14:ligatures w14:val="none"/>
+              </w:rPr>
+              <w:t>: Fastaptamer3 Desktop Shortcut</w:t>
             </w:r>
             <w:r>
               <w:rPr>
@@ -2471,7 +2907,7 @@
                 <w:vertAlign w:val="superscript"/>
                 <w14:ligatures w14:val="none"/>
               </w:rPr>
-              <w:t>10</w:t>
+              <w:t>12</w:t>
             </w:r>
             <w:r>
               <w:rPr>
@@ -2517,19 +2953,73 @@
                 <w:bdr w:val="none" w:sz="0" w:space="0" w:color="auto" w:frame="1"/>
                 <w14:ligatures w14:val="none"/>
               </w:rPr>
-              <w:t>Launch Icon</w:t>
-            </w:r>
-            <w:r>
-              <w:rPr>
-                <w:rFonts w:ascii="Arial" w:eastAsia="Times New Roman" w:hAnsi="Arial" w:cs="Arial"/>
-                <w:color w:val="1F1F1F"/>
-                <w:kern w:val="0"/>
-                <w:sz w:val="22"/>
-                <w:szCs w:val="22"/>
-                <w:bdr w:val="none" w:sz="0" w:space="0" w:color="auto" w:frame="1"/>
-                <w14:ligatures w14:val="none"/>
-              </w:rPr>
-              <w:t xml:space="preserve"> (Optional/For reference)</w:t>
+              <w:t>Container Launch/Terminal</w:t>
+            </w:r>
+          </w:p>
+        </w:tc>
+        <w:tc>
+          <w:tcPr>
+            <w:tcW w:w="0" w:type="auto"/>
+            <w:vAlign w:val="center"/>
+            <w:hideMark/>
+          </w:tcPr>
+          <w:p>
+            <w:pPr>
+              <w:jc w:val="center"/>
+              <w:rPr>
+                <w:rFonts w:ascii="Arial" w:eastAsia="Times New Roman" w:hAnsi="Arial" w:cs="Arial"/>
+                <w:color w:val="1F1F1F"/>
+                <w:kern w:val="0"/>
+                <w:sz w:val="22"/>
+                <w:szCs w:val="22"/>
+                <w14:ligatures w14:val="none"/>
+              </w:rPr>
+            </w:pPr>
+            <w:r>
+              <w:rPr>
+                <w:noProof/>
+              </w:rPr>
+              <w:drawing>
+                <wp:inline distT="0" distB="0" distL="0" distR="0" wp14:anchorId="2B45E335" wp14:editId="6943D888">
+                  <wp:extent cx="4477110" cy="2546117"/>
+                  <wp:effectExtent l="0" t="0" r="0" b="6985"/>
+                  <wp:docPr id="699594671" name="Picture 1" descr="A screenshot of a computer&#10;&#10;AI-generated content may be incorrect.">
+                    <a:extLst xmlns:a="http://schemas.openxmlformats.org/drawingml/2006/main">
+                      <a:ext uri="{FF2B5EF4-FFF2-40B4-BE49-F238E27FC236}">
+                        <a16:creationId xmlns:a16="http://schemas.microsoft.com/office/drawing/2014/main" id="{955011F5-D6B1-45C0-8242-5BAE2CF1C44B}"/>
+                      </a:ext>
+                    </a:extLst>
+                  </wp:docPr>
+                  <wp:cNvGraphicFramePr>
+                    <a:graphicFrameLocks xmlns:a="http://schemas.openxmlformats.org/drawingml/2006/main" noChangeAspect="1"/>
+                  </wp:cNvGraphicFramePr>
+                  <a:graphic xmlns:a="http://schemas.openxmlformats.org/drawingml/2006/main">
+                    <a:graphicData uri="http://schemas.openxmlformats.org/drawingml/2006/picture">
+                      <pic:pic xmlns:pic="http://schemas.openxmlformats.org/drawingml/2006/picture">
+                        <pic:nvPicPr>
+                          <pic:cNvPr id="699594671" name="Picture 1" descr="A screenshot of a computer&#10;&#10;AI-generated content may be incorrect."/>
+                          <pic:cNvPicPr/>
+                        </pic:nvPicPr>
+                        <pic:blipFill>
+                          <a:blip r:embed="rId12"/>
+                          <a:stretch>
+                            <a:fillRect/>
+                          </a:stretch>
+                        </pic:blipFill>
+                        <pic:spPr>
+                          <a:xfrm>
+                            <a:off x="0" y="0"/>
+                            <a:ext cx="4485699" cy="2551002"/>
+                          </a:xfrm>
+                          <a:prstGeom prst="rect">
+                            <a:avLst/>
+                          </a:prstGeom>
+                        </pic:spPr>
+                      </pic:pic>
+                    </a:graphicData>
+                  </a:graphic>
+                </wp:inline>
+              </w:drawing>
             </w:r>
           </w:p>
         </w:tc>
@@ -2549,6 +3039,374 @@
                 <w14:ligatures w14:val="none"/>
               </w:rPr>
             </w:pPr>
+            <w:r>
+              <w:rPr>
+                <w:rFonts w:ascii="Arial" w:eastAsia="Times New Roman" w:hAnsi="Arial" w:cs="Arial"/>
+                <w:b/>
+                <w:bCs/>
+                <w:color w:val="1F1F1F"/>
+                <w:kern w:val="0"/>
+                <w:sz w:val="22"/>
+                <w:szCs w:val="22"/>
+                <w:bdr w:val="none" w:sz="0" w:space="0" w:color="auto" w:frame="1"/>
+                <w14:ligatures w14:val="none"/>
+              </w:rPr>
+              <w:t>Figure 2.</w:t>
+            </w:r>
+            <w:r>
+              <w:rPr>
+                <w:rFonts w:ascii="Arial" w:eastAsia="DengXian" w:hAnsi="Arial" w:cs="Arial" w:hint="eastAsia"/>
+                <w:b/>
+                <w:bCs/>
+                <w:color w:val="1F1F1F"/>
+                <w:kern w:val="0"/>
+                <w:sz w:val="22"/>
+                <w:szCs w:val="22"/>
+                <w:bdr w:val="none" w:sz="0" w:space="0" w:color="auto" w:frame="1"/>
+                <w14:ligatures w14:val="none"/>
+              </w:rPr>
+              <w:t>5</w:t>
+            </w:r>
+            <w:r>
+              <w:rPr>
+                <w:rFonts w:ascii="Arial" w:eastAsia="Times New Roman" w:hAnsi="Arial" w:cs="Arial"/>
+                <w:b/>
+                <w:bCs/>
+                <w:color w:val="1F1F1F"/>
+                <w:kern w:val="0"/>
+                <w:sz w:val="22"/>
+                <w:szCs w:val="22"/>
+                <w:bdr w:val="none" w:sz="0" w:space="0" w:color="auto" w:frame="1"/>
+                <w14:ligatures w14:val="none"/>
+              </w:rPr>
+              <w:t>: Application Startup Console.</w:t>
+            </w:r>
+            <w:r>
+              <w:rPr>
+                <w:rFonts w:ascii="Arial" w:eastAsia="Times New Roman" w:hAnsi="Arial" w:cs="Arial"/>
+                <w:color w:val="1F1F1F"/>
+                <w:kern w:val="0"/>
+                <w:sz w:val="22"/>
+                <w:szCs w:val="22"/>
+                <w:bdr w:val="none" w:sz="0" w:space="0" w:color="auto" w:frame="1"/>
+                <w14:ligatures w14:val="none"/>
+              </w:rPr>
+              <w:t xml:space="preserve"> This window must remain open while using Fastaptamer3. Wait for the "App is now available" message before proceeding to the web browser</w:t>
+            </w:r>
+            <w:r>
+              <w:rPr>
+                <w:rFonts w:ascii="Arial" w:eastAsia="Times New Roman" w:hAnsi="Arial" w:cs="Arial"/>
+                <w:color w:val="444746"/>
+                <w:kern w:val="0"/>
+                <w:sz w:val="22"/>
+                <w:szCs w:val="22"/>
+                <w:bdr w:val="none" w:sz="0" w:space="0" w:color="auto" w:frame="1"/>
+                <w:vertAlign w:val="superscript"/>
+                <w14:ligatures w14:val="none"/>
+              </w:rPr>
+              <w:t>14</w:t>
+            </w:r>
+            <w:r>
+              <w:rPr>
+                <w:rFonts w:ascii="Arial" w:eastAsia="Times New Roman" w:hAnsi="Arial" w:cs="Arial"/>
+                <w:color w:val="1F1F1F"/>
+                <w:kern w:val="0"/>
+                <w:sz w:val="22"/>
+                <w:szCs w:val="22"/>
+                <w:bdr w:val="none" w:sz="0" w:space="0" w:color="auto" w:frame="1"/>
+                <w14:ligatures w14:val="none"/>
+              </w:rPr>
+              <w:t>.</w:t>
+            </w:r>
+          </w:p>
+        </w:tc>
+      </w:tr>
+      <w:tr>
+        <w:tc>
+          <w:tcPr>
+            <w:tcW w:w="0" w:type="auto"/>
+          </w:tcPr>
+          <w:p>
+            <w:pPr>
+              <w:rPr>
+                <w:rFonts w:ascii="Arial" w:eastAsia="Times New Roman" w:hAnsi="Arial" w:cs="Arial"/>
+                <w:b/>
+                <w:bCs/>
+                <w:color w:val="1F1F1F"/>
+                <w:kern w:val="0"/>
+                <w:sz w:val="22"/>
+                <w:szCs w:val="22"/>
+                <w:bdr w:val="none" w:sz="0" w:space="0" w:color="auto" w:frame="1"/>
+                <w14:ligatures w14:val="none"/>
+              </w:rPr>
+            </w:pPr>
+            <w:r>
+              <w:rPr>
+                <w:rFonts w:ascii="Arial" w:eastAsia="Times New Roman" w:hAnsi="Arial" w:cs="Arial"/>
+                <w:b/>
+                <w:bCs/>
+                <w:color w:val="1F1F1F"/>
+                <w:kern w:val="0"/>
+                <w:sz w:val="22"/>
+                <w:szCs w:val="22"/>
+                <w:bdr w:val="none" w:sz="0" w:space="0" w:color="auto" w:frame="1"/>
+                <w14:ligatures w14:val="none"/>
+              </w:rPr>
+              <w:lastRenderedPageBreak/>
+              <w:t>Running Containers</w:t>
+            </w:r>
+            <w:r>
+              <w:rPr>
+                <w:rFonts w:ascii="Arial" w:eastAsia="Times New Roman" w:hAnsi="Arial" w:cs="Arial"/>
+                <w:color w:val="1F1F1F"/>
+                <w:kern w:val="0"/>
+                <w:sz w:val="22"/>
+                <w:szCs w:val="22"/>
+                <w:bdr w:val="none" w:sz="0" w:space="0" w:color="auto" w:frame="1"/>
+                <w14:ligatures w14:val="none"/>
+              </w:rPr>
+              <w:t xml:space="preserve"> (Verification)</w:t>
+            </w:r>
+          </w:p>
+        </w:tc>
+        <w:tc>
+          <w:tcPr>
+            <w:tcW w:w="0" w:type="auto"/>
+            <w:vAlign w:val="center"/>
+          </w:tcPr>
+          <w:p>
+            <w:pPr>
+              <w:jc w:val="center"/>
+              <w:rPr>
+                <w:noProof/>
+              </w:rPr>
+            </w:pPr>
+            <w:r>
+              <w:rPr>
+                <w:b/>
+                <w:bCs/>
+                <w:noProof/>
+                <w:color w:val="000000" w:themeColor="text1"/>
+              </w:rPr>
+              <w:drawing>
+                <wp:inline distT="0" distB="0" distL="0" distR="0" wp14:anchorId="4CA37EA7" wp14:editId="6AD6CD2B">
+                  <wp:extent cx="3839857" cy="2182483"/>
+                  <wp:effectExtent l="0" t="0" r="8255" b="8890"/>
+                  <wp:docPr id="484380202" name="Picture 9" descr="A screenshot of a computer&#10;&#10;AI-generated content may be incorrect."/>
+                  <wp:cNvGraphicFramePr>
+                    <a:graphicFrameLocks xmlns:a="http://schemas.openxmlformats.org/drawingml/2006/main" noChangeAspect="1"/>
+                  </wp:cNvGraphicFramePr>
+                  <a:graphic xmlns:a="http://schemas.openxmlformats.org/drawingml/2006/main">
+                    <a:graphicData uri="http://schemas.openxmlformats.org/drawingml/2006/picture">
+                      <pic:pic xmlns:pic="http://schemas.openxmlformats.org/drawingml/2006/picture">
+                        <pic:nvPicPr>
+                          <pic:cNvPr id="1422869011" name="Picture 9" descr="A screenshot of a computer&#10;&#10;AI-generated content may be incorrect."/>
+                          <pic:cNvPicPr/>
+                        </pic:nvPicPr>
+                        <pic:blipFill>
+                          <a:blip r:embed="rId13" cstate="print">
+                            <a:extLst>
+                              <a:ext uri="{28A0092B-C50C-407E-A947-70E740481C1C}">
+                                <a14:useLocalDpi xmlns:a14="http://schemas.microsoft.com/office/drawing/2010/main" val="0"/>
+                              </a:ext>
+                            </a:extLst>
+                          </a:blip>
+                          <a:stretch>
+                            <a:fillRect/>
+                          </a:stretch>
+                        </pic:blipFill>
+                        <pic:spPr>
+                          <a:xfrm>
+                            <a:off x="0" y="0"/>
+                            <a:ext cx="3868158" cy="2198569"/>
+                          </a:xfrm>
+                          <a:prstGeom prst="rect">
+                            <a:avLst/>
+                          </a:prstGeom>
+                        </pic:spPr>
+                      </pic:pic>
+                    </a:graphicData>
+                  </a:graphic>
+                </wp:inline>
+              </w:drawing>
+            </w:r>
+          </w:p>
+        </w:tc>
+        <w:tc>
+          <w:tcPr>
+            <w:tcW w:w="0" w:type="auto"/>
+          </w:tcPr>
+          <w:p>
+            <w:pPr>
+              <w:rPr>
+                <w:rFonts w:ascii="Arial" w:eastAsia="Times New Roman" w:hAnsi="Arial" w:cs="Arial"/>
+                <w:b/>
+                <w:bCs/>
+                <w:color w:val="1F1F1F"/>
+                <w:kern w:val="0"/>
+                <w:sz w:val="22"/>
+                <w:szCs w:val="22"/>
+                <w:bdr w:val="none" w:sz="0" w:space="0" w:color="auto" w:frame="1"/>
+                <w14:ligatures w14:val="none"/>
+              </w:rPr>
+            </w:pPr>
+            <w:r>
+              <w:rPr>
+                <w:rFonts w:ascii="Arial" w:eastAsia="Times New Roman" w:hAnsi="Arial" w:cs="Arial"/>
+                <w:b/>
+                <w:bCs/>
+                <w:color w:val="1F1F1F"/>
+                <w:kern w:val="0"/>
+                <w:sz w:val="22"/>
+                <w:szCs w:val="22"/>
+                <w:bdr w:val="none" w:sz="0" w:space="0" w:color="auto" w:frame="1"/>
+                <w14:ligatures w14:val="none"/>
+              </w:rPr>
+              <w:t>Figure 3.4: Containers Running (Verification).</w:t>
+            </w:r>
+            <w:r>
+              <w:rPr>
+                <w:rFonts w:ascii="Arial" w:eastAsia="Times New Roman" w:hAnsi="Arial" w:cs="Arial"/>
+                <w:color w:val="1F1F1F"/>
+                <w:kern w:val="0"/>
+                <w:sz w:val="22"/>
+                <w:szCs w:val="22"/>
+                <w:bdr w:val="none" w:sz="0" w:space="0" w:color="auto" w:frame="1"/>
+                <w14:ligatures w14:val="none"/>
+              </w:rPr>
+              <w:t xml:space="preserve"> The running status of the backend and frontend containers, visible in Docker Desktop</w:t>
+            </w:r>
+            <w:r>
+              <w:rPr>
+                <w:rFonts w:ascii="Arial" w:eastAsia="Times New Roman" w:hAnsi="Arial" w:cs="Arial"/>
+                <w:color w:val="444746"/>
+                <w:kern w:val="0"/>
+                <w:sz w:val="22"/>
+                <w:szCs w:val="22"/>
+                <w:bdr w:val="none" w:sz="0" w:space="0" w:color="auto" w:frame="1"/>
+                <w:vertAlign w:val="superscript"/>
+                <w14:ligatures w14:val="none"/>
+              </w:rPr>
+              <w:t>22</w:t>
+            </w:r>
+            <w:r>
+              <w:rPr>
+                <w:rFonts w:ascii="Arial" w:eastAsia="Times New Roman" w:hAnsi="Arial" w:cs="Arial"/>
+                <w:color w:val="1F1F1F"/>
+                <w:kern w:val="0"/>
+                <w:sz w:val="22"/>
+                <w:szCs w:val="22"/>
+                <w:bdr w:val="none" w:sz="0" w:space="0" w:color="auto" w:frame="1"/>
+                <w14:ligatures w14:val="none"/>
+              </w:rPr>
+              <w:t>.</w:t>
+            </w:r>
+          </w:p>
+        </w:tc>
+      </w:tr>
+    </w:tbl>
+    <w:p>
+      <w:pPr>
+        <w:rPr>
+          <w:b/>
+          <w:bCs/>
+          <w:color w:val="000000" w:themeColor="text1"/>
+        </w:rPr>
+      </w:pPr>
+    </w:p>
+    <w:p>
+      <w:pPr>
+        <w:rPr>
+          <w:b/>
+          <w:bCs/>
+          <w:color w:val="000000" w:themeColor="text1"/>
+        </w:rPr>
+      </w:pPr>
+      <w:r>
+        <w:rPr>
+          <w:b/>
+          <w:bCs/>
+          <w:color w:val="000000" w:themeColor="text1"/>
+        </w:rPr>
+        <w:t>2. macOS Installation Screenshots</w:t>
+      </w:r>
+    </w:p>
+    <w:tbl>
+      <w:tblPr>
+        <w:tblStyle w:val="TableGrid"/>
+        <w:tblW w:w="0" w:type="auto"/>
+        <w:tblLook w:val="04A0" w:firstRow="1" w:lastRow="0" w:firstColumn="1" w:lastColumn="0" w:noHBand="0" w:noVBand="1"/>
+      </w:tblPr>
+      <w:tblGrid>
+        <w:gridCol w:w="1359"/>
+        <w:gridCol w:w="5830"/>
+        <w:gridCol w:w="2161"/>
+      </w:tblGrid>
+      <w:tr>
+        <w:tc>
+          <w:tcPr>
+            <w:tcW w:w="0" w:type="auto"/>
+            <w:hideMark/>
+          </w:tcPr>
+          <w:p>
+            <w:pPr>
+              <w:rPr>
+                <w:rFonts w:ascii="Arial" w:eastAsia="Times New Roman" w:hAnsi="Arial" w:cs="Arial"/>
+                <w:color w:val="1F1F1F"/>
+                <w:kern w:val="0"/>
+                <w:sz w:val="22"/>
+                <w:szCs w:val="22"/>
+                <w14:ligatures w14:val="none"/>
+              </w:rPr>
+            </w:pPr>
+            <w:r>
+              <w:rPr>
+                <w:rFonts w:ascii="Arial" w:eastAsia="Times New Roman" w:hAnsi="Arial" w:cs="Arial"/>
+                <w:b/>
+                <w:bCs/>
+                <w:color w:val="1F1F1F"/>
+                <w:kern w:val="0"/>
+                <w:sz w:val="22"/>
+                <w:szCs w:val="22"/>
+                <w:bdr w:val="none" w:sz="0" w:space="0" w:color="auto" w:frame="1"/>
+                <w14:ligatures w14:val="none"/>
+              </w:rPr>
+              <w:t>Step in Guide</w:t>
+            </w:r>
+          </w:p>
+        </w:tc>
+        <w:tc>
+          <w:tcPr>
+            <w:tcW w:w="0" w:type="auto"/>
+            <w:vAlign w:val="center"/>
+            <w:hideMark/>
+          </w:tcPr>
+          <w:p>
+            <w:pPr>
+              <w:jc w:val="center"/>
+              <w:rPr>
+                <w:rFonts w:ascii="Arial" w:eastAsia="Times New Roman" w:hAnsi="Arial" w:cs="Arial"/>
+                <w:color w:val="1F1F1F"/>
+                <w:kern w:val="0"/>
+                <w:sz w:val="22"/>
+                <w:szCs w:val="22"/>
+                <w14:ligatures w14:val="none"/>
+              </w:rPr>
+            </w:pPr>
+            <w:r>
+              <w:rPr>
+                <w:rFonts w:ascii="Arial" w:eastAsia="Times New Roman" w:hAnsi="Arial" w:cs="Arial"/>
+                <w:b/>
+                <w:bCs/>
+                <w:color w:val="1F1F1F"/>
+                <w:kern w:val="0"/>
+                <w:sz w:val="22"/>
+                <w:szCs w:val="22"/>
+                <w:bdr w:val="none" w:sz="0" w:space="0" w:color="auto" w:frame="1"/>
+                <w14:ligatures w14:val="none"/>
+              </w:rPr>
+              <w:t>Screenshot Image</w:t>
+            </w:r>
           </w:p>
         </w:tc>
         <w:tc>
@@ -2579,32 +3437,7 @@
                 <w:bdr w:val="none" w:sz="0" w:space="0" w:color="auto" w:frame="1"/>
                 <w14:ligatures w14:val="none"/>
               </w:rPr>
-              <w:t>Figure 2.5: Fastaptamer3 Desktop Shortcut</w:t>
-            </w:r>
-            <w:r>
-              <w:rPr>
-                <w:rFonts w:ascii="Arial" w:eastAsia="Times New Roman" w:hAnsi="Arial" w:cs="Arial"/>
-                <w:color w:val="444746"/>
-                <w:kern w:val="0"/>
-                <w:sz w:val="22"/>
-                <w:szCs w:val="22"/>
-                <w:bdr w:val="none" w:sz="0" w:space="0" w:color="auto" w:frame="1"/>
-                <w:vertAlign w:val="superscript"/>
-                <w14:ligatures w14:val="none"/>
-              </w:rPr>
-              <w:t>12</w:t>
-            </w:r>
-            <w:r>
-              <w:rPr>
-                <w:rFonts w:ascii="Arial" w:eastAsia="Times New Roman" w:hAnsi="Arial" w:cs="Arial"/>
-                <w:color w:val="1F1F1F"/>
-                <w:kern w:val="0"/>
-                <w:sz w:val="22"/>
-                <w:szCs w:val="22"/>
-                <w:bdr w:val="none" w:sz="0" w:space="0" w:color="auto" w:frame="1"/>
-                <w14:ligatures w14:val="none"/>
-              </w:rPr>
-              <w:t>.</w:t>
+              <w:t>Recommended Caption/Label</w:t>
             </w:r>
           </w:p>
         </w:tc>
@@ -2638,7 +3471,88 @@
                 <w:bdr w:val="none" w:sz="0" w:space="0" w:color="auto" w:frame="1"/>
                 <w14:ligatures w14:val="none"/>
               </w:rPr>
-              <w:t>Container Launch/Terminal</w:t>
+              <w:t>Prerequisite Verification</w:t>
+            </w:r>
+            <w:r>
+              <w:rPr>
+                <w:rFonts w:ascii="Arial" w:eastAsia="Times New Roman" w:hAnsi="Arial" w:cs="Arial"/>
+                <w:color w:val="1F1F1F"/>
+                <w:kern w:val="0"/>
+                <w:sz w:val="22"/>
+                <w:szCs w:val="22"/>
+                <w:bdr w:val="none" w:sz="0" w:space="0" w:color="auto" w:frame="1"/>
+                <w14:ligatures w14:val="none"/>
+              </w:rPr>
+              <w:t xml:space="preserve"> (Docker Desktop)</w:t>
+            </w:r>
+          </w:p>
+        </w:tc>
+        <w:tc>
+          <w:tcPr>
+            <w:tcW w:w="0" w:type="auto"/>
+            <w:vAlign w:val="center"/>
+            <w:hideMark/>
+          </w:tcPr>
+          <w:p>
+            <w:pPr>
+              <w:jc w:val="center"/>
+              <w:rPr>
+                <w:rFonts w:ascii="Arial" w:eastAsia="Times New Roman" w:hAnsi="Arial" w:cs="Arial"/>
+                <w:color w:val="1F1F1F"/>
+                <w:kern w:val="0"/>
+                <w:sz w:val="22"/>
+                <w:szCs w:val="22"/>
+                <w14:ligatures w14:val="none"/>
+              </w:rPr>
+            </w:pPr>
+            <w:r>
+              <w:rPr>
+                <w:b/>
+                <w:bCs/>
+                <w:noProof/>
+                <w:color w:val="000000" w:themeColor="text1"/>
+              </w:rPr>
+              <w:drawing>
+                <wp:inline distT="0" distB="0" distL="0" distR="0" wp14:anchorId="7499C796" wp14:editId="51B8E366">
+                  <wp:extent cx="3204067" cy="1806053"/>
+                  <wp:effectExtent l="0" t="0" r="0" b="3810"/>
+                  <wp:docPr id="48227712" name="Picture 2" descr="A screenshot of a computer&#10;&#10;AI-generated content may be incorrect."/>
+                  <wp:cNvGraphicFramePr>
+                    <a:graphicFrameLocks xmlns:a="http://schemas.openxmlformats.org/drawingml/2006/main" noChangeAspect="1"/>
+                  </wp:cNvGraphicFramePr>
+                  <a:graphic xmlns:a="http://schemas.openxmlformats.org/drawingml/2006/main">
+                    <a:graphicData uri="http://schemas.openxmlformats.org/drawingml/2006/picture">
+                      <pic:pic xmlns:pic="http://schemas.openxmlformats.org/drawingml/2006/picture">
+                        <pic:nvPicPr>
+                          <pic:cNvPr id="48227712" name="Picture 2" descr="A screenshot of a computer&#10;&#10;AI-generated content may be incorrect."/>
+                          <pic:cNvPicPr/>
+                        </pic:nvPicPr>
+                        <pic:blipFill>
+                          <a:blip r:embed="rId14" cstate="print">
+                            <a:extLst>
+                              <a:ext uri="{28A0092B-C50C-407E-A947-70E740481C1C}">
+                                <a14:useLocalDpi xmlns:a14="http://schemas.microsoft.com/office/drawing/2010/main" val="0"/>
+                              </a:ext>
+                            </a:extLst>
+                          </a:blip>
+                          <a:stretch>
+                            <a:fillRect/>
+                          </a:stretch>
+                        </pic:blipFill>
+                        <pic:spPr>
+                          <a:xfrm>
+                            <a:off x="0" y="0"/>
+                            <a:ext cx="3248925" cy="1831338"/>
+                          </a:xfrm>
+                          <a:prstGeom prst="rect">
+                            <a:avLst/>
+                          </a:prstGeom>
+                        </pic:spPr>
+                      </pic:pic>
+                    </a:graphicData>
+                  </a:graphic>
+                </wp:inline>
+              </w:drawing>
             </w:r>
           </w:p>
         </w:tc>
@@ -2658,24 +3572,6 @@
                 <w14:ligatures w14:val="none"/>
               </w:rPr>
             </w:pPr>
-          </w:p>
-        </w:tc>
-        <w:tc>
-          <w:tcPr>
-            <w:tcW w:w="0" w:type="auto"/>
-            <w:hideMark/>
-          </w:tcPr>
-          <w:p>
-            <w:pPr>
-              <w:rPr>
-                <w:rFonts w:ascii="Arial" w:eastAsia="Times New Roman" w:hAnsi="Arial" w:cs="Arial"/>
-                <w:color w:val="1F1F1F"/>
-                <w:kern w:val="0"/>
-                <w:sz w:val="22"/>
-                <w:szCs w:val="22"/>
-                <w14:ligatures w14:val="none"/>
-              </w:rPr>
-            </w:pPr>
             <w:r>
               <w:rPr>
                 <w:rFonts w:ascii="Arial" w:eastAsia="Times New Roman" w:hAnsi="Arial" w:cs="Arial"/>
@@ -2688,19 +3584,19 @@
                 <w:bdr w:val="none" w:sz="0" w:space="0" w:color="auto" w:frame="1"/>
                 <w14:ligatures w14:val="none"/>
               </w:rPr>
-              <w:t>Figure 2.6: Application Startup Console.</w:t>
-            </w:r>
-            <w:r>
-              <w:rPr>
-                <w:rFonts w:ascii="Arial" w:eastAsia="Times New Roman" w:hAnsi="Arial" w:cs="Arial"/>
-                <w:color w:val="1F1F1F"/>
-                <w:kern w:val="0"/>
-                <w:sz w:val="22"/>
-                <w:szCs w:val="22"/>
-                <w:bdr w:val="none" w:sz="0" w:space="0" w:color="auto" w:frame="1"/>
-                <w14:ligatures w14:val="none"/>
-              </w:rPr>
-              <w:t xml:space="preserve"> This window must remain open while using Fastaptamer3. Wait for the "App is now available" message before proceeding to the web browser</w:t>
+              <w:t>Figure 3.1: Docker Desktop Status.</w:t>
+            </w:r>
+            <w:r>
+              <w:rPr>
+                <w:rFonts w:ascii="Arial" w:eastAsia="Times New Roman" w:hAnsi="Arial" w:cs="Arial"/>
+                <w:color w:val="1F1F1F"/>
+                <w:kern w:val="0"/>
+                <w:sz w:val="22"/>
+                <w:szCs w:val="22"/>
+                <w:bdr w:val="none" w:sz="0" w:space="0" w:color="auto" w:frame="1"/>
+                <w14:ligatures w14:val="none"/>
+              </w:rPr>
+              <w:t xml:space="preserve"> Ensure Docker Desktop is running before proceeding</w:t>
             </w:r>
             <w:r>
               <w:rPr>
@@ -2713,7 +3609,7 @@
                 <w:vertAlign w:val="superscript"/>
                 <w14:ligatures w14:val="none"/>
               </w:rPr>
-              <w:t>14</w:t>
+              <w:t>16</w:t>
             </w:r>
             <w:r>
               <w:rPr>
@@ -2726,142 +3622,6 @@
                 <w14:ligatures w14:val="none"/>
               </w:rPr>
               <w:t>.</w:t>
-            </w:r>
-          </w:p>
-        </w:tc>
-      </w:tr>
-    </w:tbl>
-    <w:p>
-      <w:pPr>
-        <w:rPr>
-          <w:b/>
-          <w:bCs/>
-          <w:color w:val="000000" w:themeColor="text1"/>
-        </w:rPr>
-      </w:pPr>
-    </w:p>
-    <w:p>
-      <w:pPr>
-        <w:rPr>
-          <w:b/>
-          <w:bCs/>
-          <w:color w:val="000000" w:themeColor="text1"/>
-        </w:rPr>
-      </w:pPr>
-      <w:r>
-        <w:rPr>
-          <w:b/>
-          <w:bCs/>
-          <w:color w:val="000000" w:themeColor="text1"/>
-        </w:rPr>
-        <w:t>2. macOS Installation Screenshots</w:t>
-      </w:r>
-    </w:p>
-    <w:tbl>
-      <w:tblPr>
-        <w:tblStyle w:val="TableGrid"/>
-        <w:tblW w:w="0" w:type="auto"/>
-        <w:tblLook w:val="04A0" w:firstRow="1" w:lastRow="0" w:firstColumn="1" w:lastColumn="0" w:noHBand="0" w:noVBand="1"/>
-      </w:tblPr>
-      <w:tblGrid>
-        <w:gridCol w:w="2274"/>
-        <w:gridCol w:w="1596"/>
-        <w:gridCol w:w="5480"/>
-      </w:tblGrid>
-      <w:tr>
-        <w:tc>
-          <w:tcPr>
-            <w:tcW w:w="0" w:type="auto"/>
-            <w:hideMark/>
-          </w:tcPr>
-          <w:p>
-            <w:pPr>
-              <w:rPr>
-                <w:rFonts w:ascii="Arial" w:eastAsia="Times New Roman" w:hAnsi="Arial" w:cs="Arial"/>
-                <w:color w:val="1F1F1F"/>
-                <w:kern w:val="0"/>
-                <w:sz w:val="22"/>
-                <w:szCs w:val="22"/>
-                <w14:ligatures w14:val="none"/>
-              </w:rPr>
-            </w:pPr>
-            <w:r>
-              <w:rPr>
-                <w:rFonts w:ascii="Arial" w:eastAsia="Times New Roman" w:hAnsi="Arial" w:cs="Arial"/>
-                <w:b/>
-                <w:bCs/>
-                <w:color w:val="1F1F1F"/>
-                <w:kern w:val="0"/>
-                <w:sz w:val="22"/>
-                <w:szCs w:val="22"/>
-                <w:bdr w:val="none" w:sz="0" w:space="0" w:color="auto" w:frame="1"/>
-                <w14:ligatures w14:val="none"/>
-              </w:rPr>
-              <w:t>Step in Guide</w:t>
-            </w:r>
-          </w:p>
-        </w:tc>
-        <w:tc>
-          <w:tcPr>
-            <w:tcW w:w="0" w:type="auto"/>
-            <w:hideMark/>
-          </w:tcPr>
-          <w:p>
-            <w:pPr>
-              <w:rPr>
-                <w:rFonts w:ascii="Arial" w:eastAsia="Times New Roman" w:hAnsi="Arial" w:cs="Arial"/>
-                <w:color w:val="1F1F1F"/>
-                <w:kern w:val="0"/>
-                <w:sz w:val="22"/>
-                <w:szCs w:val="22"/>
-                <w14:ligatures w14:val="none"/>
-              </w:rPr>
-            </w:pPr>
-            <w:r>
-              <w:rPr>
-                <w:rFonts w:ascii="Arial" w:eastAsia="Times New Roman" w:hAnsi="Arial" w:cs="Arial"/>
-                <w:b/>
-                <w:bCs/>
-                <w:color w:val="1F1F1F"/>
-                <w:kern w:val="0"/>
-                <w:sz w:val="22"/>
-                <w:szCs w:val="22"/>
-                <w:bdr w:val="none" w:sz="0" w:space="0" w:color="auto" w:frame="1"/>
-                <w14:ligatures w14:val="none"/>
-              </w:rPr>
-              <w:t>Screenshot Image</w:t>
-            </w:r>
-          </w:p>
-        </w:tc>
-        <w:tc>
-          <w:tcPr>
-            <w:tcW w:w="0" w:type="auto"/>
-            <w:hideMark/>
-          </w:tcPr>
-          <w:p>
-            <w:pPr>
-              <w:rPr>
-                <w:rFonts w:ascii="Arial" w:eastAsia="Times New Roman" w:hAnsi="Arial" w:cs="Arial"/>
-                <w:color w:val="1F1F1F"/>
-                <w:kern w:val="0"/>
-                <w:sz w:val="22"/>
-                <w:szCs w:val="22"/>
-                <w14:ligatures w14:val="none"/>
-              </w:rPr>
-            </w:pPr>
-            <w:r>
-              <w:rPr>
-                <w:rFonts w:ascii="Arial" w:eastAsia="Times New Roman" w:hAnsi="Arial" w:cs="Arial"/>
-                <w:b/>
-                <w:bCs/>
-                <w:color w:val="1F1F1F"/>
-                <w:kern w:val="0"/>
-                <w:sz w:val="22"/>
-                <w:szCs w:val="22"/>
-                <w:bdr w:val="none" w:sz="0" w:space="0" w:color="auto" w:frame="1"/>
-                <w14:ligatures w14:val="none"/>
-              </w:rPr>
-              <w:t>Recommended Caption/Label</w:t>
             </w:r>
           </w:p>
         </w:tc>
@@ -2895,19 +3655,85 @@
                 <w:bdr w:val="none" w:sz="0" w:space="0" w:color="auto" w:frame="1"/>
                 <w14:ligatures w14:val="none"/>
               </w:rPr>
-              <w:t>Prerequisite Verification</w:t>
-            </w:r>
-            <w:r>
-              <w:rPr>
-                <w:rFonts w:ascii="Arial" w:eastAsia="Times New Roman" w:hAnsi="Arial" w:cs="Arial"/>
-                <w:color w:val="1F1F1F"/>
-                <w:kern w:val="0"/>
-                <w:sz w:val="22"/>
-                <w:szCs w:val="22"/>
-                <w:bdr w:val="none" w:sz="0" w:space="0" w:color="auto" w:frame="1"/>
-                <w14:ligatures w14:val="none"/>
-              </w:rPr>
-              <w:t xml:space="preserve"> (Docker Desktop)</w:t>
+              <w:t>DMG Contents</w:t>
+            </w:r>
+          </w:p>
+        </w:tc>
+        <w:tc>
+          <w:tcPr>
+            <w:tcW w:w="0" w:type="auto"/>
+            <w:vAlign w:val="center"/>
+            <w:hideMark/>
+          </w:tcPr>
+          <w:p>
+            <w:pPr>
+              <w:jc w:val="center"/>
+              <w:rPr>
+                <w:rFonts w:ascii="Arial" w:eastAsia="Times New Roman" w:hAnsi="Arial" w:cs="Arial"/>
+                <w:color w:val="1F1F1F"/>
+                <w:kern w:val="0"/>
+                <w:sz w:val="22"/>
+                <w:szCs w:val="22"/>
+                <w14:ligatures w14:val="none"/>
+              </w:rPr>
+            </w:pPr>
+            <w:r>
+              <w:rPr>
+                <w:b/>
+                <w:bCs/>
+                <w:noProof/>
+                <w:color w:val="000000" w:themeColor="text1"/>
+              </w:rPr>
+              <w:drawing>
+                <wp:inline distT="0" distB="0" distL="0" distR="0" wp14:anchorId="58C8B191" wp14:editId="6EEB3E10">
+                  <wp:extent cx="3968150" cy="713303"/>
+                  <wp:effectExtent l="0" t="0" r="0" b="0"/>
+                  <wp:docPr id="70102954" name="Picture 3" descr="A screenshot of a computer&#10;&#10;AI-generated content may be incorrect."/>
+                  <wp:cNvGraphicFramePr>
+                    <a:graphicFrameLocks xmlns:a="http://schemas.openxmlformats.org/drawingml/2006/main" noChangeAspect="1"/>
+                  </wp:cNvGraphicFramePr>
+                  <a:graphic xmlns:a="http://schemas.openxmlformats.org/drawingml/2006/main">
+                    <a:graphicData uri="http://schemas.openxmlformats.org/drawingml/2006/picture">
+                      <pic:pic xmlns:pic="http://schemas.openxmlformats.org/drawingml/2006/picture">
+                        <pic:nvPicPr>
+                          <pic:cNvPr id="70102954" name="Picture 3" descr="A screenshot of a computer&#10;&#10;AI-generated content may be incorrect."/>
+                          <pic:cNvPicPr/>
+                        </pic:nvPicPr>
+                        <pic:blipFill rotWithShape="1">
+                          <a:blip r:embed="rId15" cstate="print">
+                            <a:extLst>
+                              <a:ext uri="{28A0092B-C50C-407E-A947-70E740481C1C}">
+                                <a14:useLocalDpi xmlns:a14="http://schemas.microsoft.com/office/drawing/2010/main" val="0"/>
+                              </a:ext>
+                            </a:extLst>
+                          </a:blip>
+                          <a:srcRect b="57842"/>
+                          <a:stretch>
+                            <a:fillRect/>
+                          </a:stretch>
+                        </pic:blipFill>
+                        <pic:spPr bwMode="auto">
+                          <a:xfrm>
+                            <a:off x="0" y="0"/>
+                            <a:ext cx="4005733" cy="720059"/>
+                          </a:xfrm>
+                          <a:prstGeom prst="rect">
+                            <a:avLst/>
+                          </a:prstGeom>
+                          <a:ln>
+                            <a:noFill/>
+                          </a:ln>
+                          <a:extLst>
+                            <a:ext uri="{53640926-AAD7-44D8-BBD7-CCE9431645EC}">
+                              <a14:shadowObscured xmlns:a14="http://schemas.microsoft.com/office/drawing/2010/main"/>
+                            </a:ext>
+                          </a:extLst>
+                        </pic:spPr>
+                      </pic:pic>
+                    </a:graphicData>
+                  </a:graphic>
+                </wp:inline>
+              </w:drawing>
             </w:r>
           </w:p>
         </w:tc>
@@ -2927,24 +3753,6 @@
                 <w14:ligatures w14:val="none"/>
               </w:rPr>
             </w:pPr>
-          </w:p>
-        </w:tc>
-        <w:tc>
-          <w:tcPr>
-            <w:tcW w:w="0" w:type="auto"/>
-            <w:hideMark/>
-          </w:tcPr>
-          <w:p>
-            <w:pPr>
-              <w:rPr>
-                <w:rFonts w:ascii="Arial" w:eastAsia="Times New Roman" w:hAnsi="Arial" w:cs="Arial"/>
-                <w:color w:val="1F1F1F"/>
-                <w:kern w:val="0"/>
-                <w:sz w:val="22"/>
-                <w:szCs w:val="22"/>
-                <w14:ligatures w14:val="none"/>
-              </w:rPr>
-            </w:pPr>
             <w:r>
               <w:rPr>
                 <w:rFonts w:ascii="Arial" w:eastAsia="Times New Roman" w:hAnsi="Arial" w:cs="Arial"/>
@@ -2957,32 +3765,58 @@
                 <w:bdr w:val="none" w:sz="0" w:space="0" w:color="auto" w:frame="1"/>
                 <w14:ligatures w14:val="none"/>
               </w:rPr>
-              <w:t>Figure 3.1: Docker Desktop Status.</w:t>
-            </w:r>
-            <w:r>
-              <w:rPr>
-                <w:rFonts w:ascii="Arial" w:eastAsia="Times New Roman" w:hAnsi="Arial" w:cs="Arial"/>
-                <w:color w:val="1F1F1F"/>
-                <w:kern w:val="0"/>
-                <w:sz w:val="22"/>
-                <w:szCs w:val="22"/>
-                <w:bdr w:val="none" w:sz="0" w:space="0" w:color="auto" w:frame="1"/>
-                <w14:ligatures w14:val="none"/>
-              </w:rPr>
-              <w:t xml:space="preserve"> Ensure Docker Desktop is running before proceeding</w:t>
-            </w:r>
-            <w:r>
-              <w:rPr>
-                <w:rFonts w:ascii="Arial" w:eastAsia="Times New Roman" w:hAnsi="Arial" w:cs="Arial"/>
+              <w:t>Figure 3.2: Fastaptamer3 Disk Image.</w:t>
+            </w:r>
+            <w:r>
+              <w:rPr>
+                <w:rFonts w:ascii="Arial" w:eastAsia="Times New Roman" w:hAnsi="Arial" w:cs="Arial"/>
+                <w:color w:val="1F1F1F"/>
+                <w:kern w:val="0"/>
+                <w:sz w:val="22"/>
+                <w:szCs w:val="22"/>
+                <w:bdr w:val="none" w:sz="0" w:space="0" w:color="auto" w:frame="1"/>
+                <w14:ligatures w14:val="none"/>
+              </w:rPr>
+              <w:t xml:space="preserve"> Double-click the </w:t>
+            </w:r>
+            <w:r>
+              <w:rPr>
+                <w:rFonts w:ascii="Arial" w:eastAsia="Times New Roman" w:hAnsi="Arial" w:cs="Arial"/>
+                <w:b/>
+                <w:bCs/>
                 <w:color w:val="444746"/>
                 <w:kern w:val="0"/>
                 <w:sz w:val="22"/>
                 <w:szCs w:val="22"/>
                 <w:bdr w:val="none" w:sz="0" w:space="0" w:color="auto" w:frame="1"/>
+                <w14:ligatures w14:val="none"/>
+              </w:rPr>
+              <w:t>run_fastaptamer3.sh</w:t>
+            </w:r>
+            <w:r>
+              <w:rPr>
+                <w:rFonts w:ascii="Arial" w:eastAsia="Times New Roman" w:hAnsi="Arial" w:cs="Arial"/>
+                <w:color w:val="1F1F1F"/>
+                <w:kern w:val="0"/>
+                <w:sz w:val="22"/>
+                <w:szCs w:val="22"/>
+                <w:bdr w:val="none" w:sz="0" w:space="0" w:color="auto" w:frame="1"/>
+                <w14:ligatures w14:val="none"/>
+              </w:rPr>
+              <w:t xml:space="preserve"> script to begin the application launch process</w:t>
+            </w:r>
+            <w:r>
+              <w:rPr>
+                <w:rFonts w:ascii="Arial" w:eastAsia="Times New Roman" w:hAnsi="Arial" w:cs="Arial"/>
+                <w:color w:val="444746"/>
+                <w:kern w:val="0"/>
+                <w:sz w:val="22"/>
+                <w:szCs w:val="22"/>
+                <w:bdr w:val="none" w:sz="0" w:space="0" w:color="auto" w:frame="1"/>
                 <w:vertAlign w:val="superscript"/>
                 <w14:ligatures w14:val="none"/>
               </w:rPr>
-              <w:t>16</w:t>
+              <w:t>18</w:t>
             </w:r>
             <w:r>
               <w:rPr>
@@ -3028,7 +3862,86 @@
                 <w:bdr w:val="none" w:sz="0" w:space="0" w:color="auto" w:frame="1"/>
                 <w14:ligatures w14:val="none"/>
               </w:rPr>
-              <w:t>DMG Contents</w:t>
+              <w:lastRenderedPageBreak/>
+              <w:t>Terminal Window</w:t>
+            </w:r>
+          </w:p>
+        </w:tc>
+        <w:tc>
+          <w:tcPr>
+            <w:tcW w:w="0" w:type="auto"/>
+            <w:vAlign w:val="center"/>
+            <w:hideMark/>
+          </w:tcPr>
+          <w:p>
+            <w:pPr>
+              <w:jc w:val="center"/>
+              <w:rPr>
+                <w:rFonts w:ascii="Arial" w:eastAsia="Times New Roman" w:hAnsi="Arial" w:cs="Arial"/>
+                <w:color w:val="1F1F1F"/>
+                <w:kern w:val="0"/>
+                <w:sz w:val="22"/>
+                <w:szCs w:val="22"/>
+                <w14:ligatures w14:val="none"/>
+              </w:rPr>
+            </w:pPr>
+            <w:r>
+              <w:rPr>
+                <w:b/>
+                <w:bCs/>
+                <w:noProof/>
+                <w:color w:val="000000" w:themeColor="text1"/>
+              </w:rPr>
+              <w:drawing>
+                <wp:inline distT="0" distB="0" distL="0" distR="0" wp14:anchorId="47A45DB1" wp14:editId="4C3E0DA0">
+                  <wp:extent cx="3467735" cy="2678720"/>
+                  <wp:effectExtent l="0" t="0" r="0" b="7620"/>
+                  <wp:docPr id="746052161" name="Picture 2" descr="A screenshot of a computer&#10;&#10;AI-generated content may be incorrect."/>
+                  <wp:cNvGraphicFramePr>
+                    <a:graphicFrameLocks xmlns:a="http://schemas.openxmlformats.org/drawingml/2006/main" noChangeAspect="1"/>
+                  </wp:cNvGraphicFramePr>
+                  <a:graphic xmlns:a="http://schemas.openxmlformats.org/drawingml/2006/main">
+                    <a:graphicData uri="http://schemas.openxmlformats.org/drawingml/2006/picture">
+                      <pic:pic xmlns:pic="http://schemas.openxmlformats.org/drawingml/2006/picture">
+                        <pic:nvPicPr>
+                          <pic:cNvPr id="746052161" name="Picture 2" descr="A screenshot of a computer&#10;&#10;AI-generated content may be incorrect."/>
+                          <pic:cNvPicPr/>
+                        </pic:nvPicPr>
+                        <pic:blipFill rotWithShape="1">
+                          <a:blip r:embed="rId16" cstate="print">
+                            <a:extLst>
+                              <a:ext uri="{28A0092B-C50C-407E-A947-70E740481C1C}">
+                                <a14:useLocalDpi xmlns:a14="http://schemas.microsoft.com/office/drawing/2010/main" val="0"/>
+                              </a:ext>
+                            </a:extLst>
+                          </a:blip>
+                          <a:srcRect b="4664"/>
+                          <a:stretch>
+                            <a:fillRect/>
+                          </a:stretch>
+                        </pic:blipFill>
+                        <pic:spPr bwMode="auto">
+                          <a:xfrm>
+                            <a:off x="0" y="0"/>
+                            <a:ext cx="3485474" cy="2692422"/>
+                          </a:xfrm>
+                          <a:prstGeom prst="rect">
+                            <a:avLst/>
+                          </a:prstGeom>
+                          <a:ln>
+                            <a:noFill/>
+                          </a:ln>
+                          <a:extLst>
+                            <a:ext uri="{53640926-AAD7-44D8-BBD7-CCE9431645EC}">
+                              <a14:shadowObscured xmlns:a14="http://schemas.microsoft.com/office/drawing/2010/main"/>
+                            </a:ext>
+                          </a:extLst>
+                        </pic:spPr>
+                      </pic:pic>
+                    </a:graphicData>
+                  </a:graphic>
+                </wp:inline>
+              </w:drawing>
             </w:r>
           </w:p>
         </w:tc>
@@ -3048,24 +3961,6 @@
                 <w14:ligatures w14:val="none"/>
               </w:rPr>
             </w:pPr>
-          </w:p>
-        </w:tc>
-        <w:tc>
-          <w:tcPr>
-            <w:tcW w:w="0" w:type="auto"/>
-            <w:hideMark/>
-          </w:tcPr>
-          <w:p>
-            <w:pPr>
-              <w:rPr>
-                <w:rFonts w:ascii="Arial" w:eastAsia="Times New Roman" w:hAnsi="Arial" w:cs="Arial"/>
-                <w:color w:val="1F1F1F"/>
-                <w:kern w:val="0"/>
-                <w:sz w:val="22"/>
-                <w:szCs w:val="22"/>
-                <w14:ligatures w14:val="none"/>
-              </w:rPr>
-            </w:pPr>
             <w:r>
               <w:rPr>
                 <w:rFonts w:ascii="Arial" w:eastAsia="Times New Roman" w:hAnsi="Arial" w:cs="Arial"/>
@@ -3078,58 +3973,58 @@
                 <w:bdr w:val="none" w:sz="0" w:space="0" w:color="auto" w:frame="1"/>
                 <w14:ligatures w14:val="none"/>
               </w:rPr>
-              <w:t>Figure 3.2: Fastaptamer3 Disk Image.</w:t>
-            </w:r>
-            <w:r>
-              <w:rPr>
-                <w:rFonts w:ascii="Arial" w:eastAsia="Times New Roman" w:hAnsi="Arial" w:cs="Arial"/>
-                <w:color w:val="1F1F1F"/>
-                <w:kern w:val="0"/>
-                <w:sz w:val="22"/>
-                <w:szCs w:val="22"/>
-                <w:bdr w:val="none" w:sz="0" w:space="0" w:color="auto" w:frame="1"/>
-                <w14:ligatures w14:val="none"/>
-              </w:rPr>
-              <w:t xml:space="preserve"> Double-click the </w:t>
+              <w:t>Figure 3.3: Launch Terminal.</w:t>
+            </w:r>
+            <w:r>
+              <w:rPr>
+                <w:rFonts w:ascii="Arial" w:eastAsia="Times New Roman" w:hAnsi="Arial" w:cs="Arial"/>
+                <w:color w:val="1F1F1F"/>
+                <w:kern w:val="0"/>
+                <w:sz w:val="22"/>
+                <w:szCs w:val="22"/>
+                <w:bdr w:val="none" w:sz="0" w:space="0" w:color="auto" w:frame="1"/>
+                <w14:ligatures w14:val="none"/>
+              </w:rPr>
+              <w:t xml:space="preserve"> This Terminal window manages the application containers and </w:t>
             </w:r>
             <w:r>
               <w:rPr>
                 <w:rFonts w:ascii="Arial" w:eastAsia="Times New Roman" w:hAnsi="Arial" w:cs="Arial"/>
                 <w:b/>
                 <w:bCs/>
+                <w:color w:val="1F1F1F"/>
+                <w:kern w:val="0"/>
+                <w:sz w:val="22"/>
+                <w:szCs w:val="22"/>
+                <w:bdr w:val="none" w:sz="0" w:space="0" w:color="auto" w:frame="1"/>
+                <w14:ligatures w14:val="none"/>
+              </w:rPr>
+              <w:t>must remain open</w:t>
+            </w:r>
+            <w:r>
+              <w:rPr>
+                <w:rFonts w:ascii="Arial" w:eastAsia="Times New Roman" w:hAnsi="Arial" w:cs="Arial"/>
+                <w:color w:val="1F1F1F"/>
+                <w:kern w:val="0"/>
+                <w:sz w:val="22"/>
+                <w:szCs w:val="22"/>
+                <w:bdr w:val="none" w:sz="0" w:space="0" w:color="auto" w:frame="1"/>
+                <w14:ligatures w14:val="none"/>
+              </w:rPr>
+              <w:t xml:space="preserve"> while you use Fastaptamer3</w:t>
+            </w:r>
+            <w:r>
+              <w:rPr>
+                <w:rFonts w:ascii="Arial" w:eastAsia="Times New Roman" w:hAnsi="Arial" w:cs="Arial"/>
                 <w:color w:val="444746"/>
                 <w:kern w:val="0"/>
                 <w:sz w:val="22"/>
                 <w:szCs w:val="22"/>
                 <w:bdr w:val="none" w:sz="0" w:space="0" w:color="auto" w:frame="1"/>
-                <w14:ligatures w14:val="none"/>
-              </w:rPr>
-              <w:t>run_fastaptamer3.sh</w:t>
-            </w:r>
-            <w:r>
-              <w:rPr>
-                <w:rFonts w:ascii="Arial" w:eastAsia="Times New Roman" w:hAnsi="Arial" w:cs="Arial"/>
-                <w:color w:val="1F1F1F"/>
-                <w:kern w:val="0"/>
-                <w:sz w:val="22"/>
-                <w:szCs w:val="22"/>
-                <w:bdr w:val="none" w:sz="0" w:space="0" w:color="auto" w:frame="1"/>
-                <w14:ligatures w14:val="none"/>
-              </w:rPr>
-              <w:t xml:space="preserve"> script to begin the application launch process</w:t>
-            </w:r>
-            <w:r>
-              <w:rPr>
-                <w:rFonts w:ascii="Arial" w:eastAsia="Times New Roman" w:hAnsi="Arial" w:cs="Arial"/>
-                <w:color w:val="444746"/>
-                <w:kern w:val="0"/>
-                <w:sz w:val="22"/>
-                <w:szCs w:val="22"/>
-                <w:bdr w:val="none" w:sz="0" w:space="0" w:color="auto" w:frame="1"/>
                 <w:vertAlign w:val="superscript"/>
                 <w14:ligatures w14:val="none"/>
               </w:rPr>
-              <w:t>18</w:t>
+              <w:t>20</w:t>
             </w:r>
             <w:r>
               <w:rPr>
@@ -3175,17 +4070,31 @@
                 <w:bdr w:val="none" w:sz="0" w:space="0" w:color="auto" w:frame="1"/>
                 <w14:ligatures w14:val="none"/>
               </w:rPr>
-              <w:t>Terminal Window</w:t>
+              <w:t>Running Containers</w:t>
+            </w:r>
+            <w:r>
+              <w:rPr>
+                <w:rFonts w:ascii="Arial" w:eastAsia="Times New Roman" w:hAnsi="Arial" w:cs="Arial"/>
+                <w:color w:val="1F1F1F"/>
+                <w:kern w:val="0"/>
+                <w:sz w:val="22"/>
+                <w:szCs w:val="22"/>
+                <w:bdr w:val="none" w:sz="0" w:space="0" w:color="auto" w:frame="1"/>
+                <w14:ligatures w14:val="none"/>
+              </w:rPr>
+              <w:t xml:space="preserve"> (Verification)</w:t>
             </w:r>
           </w:p>
         </w:tc>
         <w:tc>
           <w:tcPr>
             <w:tcW w:w="0" w:type="auto"/>
+            <w:vAlign w:val="center"/>
             <w:hideMark/>
           </w:tcPr>
           <w:p>
             <w:pPr>
+              <w:jc w:val="center"/>
               <w:rPr>
                 <w:rFonts w:ascii="Arial" w:eastAsia="Times New Roman" w:hAnsi="Arial" w:cs="Arial"/>
                 <w:color w:val="1F1F1F"/>
@@ -3195,165 +4104,55 @@
                 <w14:ligatures w14:val="none"/>
               </w:rPr>
             </w:pPr>
-          </w:p>
-        </w:tc>
-        <w:tc>
-          <w:tcPr>
-            <w:tcW w:w="0" w:type="auto"/>
-            <w:hideMark/>
-          </w:tcPr>
-          <w:p>
-            <w:pPr>
-              <w:rPr>
-                <w:rFonts w:ascii="Arial" w:eastAsia="Times New Roman" w:hAnsi="Arial" w:cs="Arial"/>
-                <w:color w:val="1F1F1F"/>
-                <w:kern w:val="0"/>
-                <w:sz w:val="22"/>
-                <w:szCs w:val="22"/>
-                <w14:ligatures w14:val="none"/>
-              </w:rPr>
-            </w:pPr>
-            <w:r>
-              <w:rPr>
-                <w:rFonts w:ascii="Arial" w:eastAsia="Times New Roman" w:hAnsi="Arial" w:cs="Arial"/>
+            <w:r>
+              <w:rPr>
                 <w:b/>
                 <w:bCs/>
-                <w:color w:val="1F1F1F"/>
-                <w:kern w:val="0"/>
-                <w:sz w:val="22"/>
-                <w:szCs w:val="22"/>
-                <w:bdr w:val="none" w:sz="0" w:space="0" w:color="auto" w:frame="1"/>
-                <w14:ligatures w14:val="none"/>
-              </w:rPr>
-              <w:t>Figure 3.3: Launch Terminal.</w:t>
-            </w:r>
-            <w:r>
-              <w:rPr>
-                <w:rFonts w:ascii="Arial" w:eastAsia="Times New Roman" w:hAnsi="Arial" w:cs="Arial"/>
-                <w:color w:val="1F1F1F"/>
-                <w:kern w:val="0"/>
-                <w:sz w:val="22"/>
-                <w:szCs w:val="22"/>
-                <w:bdr w:val="none" w:sz="0" w:space="0" w:color="auto" w:frame="1"/>
-                <w14:ligatures w14:val="none"/>
-              </w:rPr>
-              <w:t xml:space="preserve"> This Terminal window manages the application containers and </w:t>
-            </w:r>
-            <w:r>
-              <w:rPr>
-                <w:rFonts w:ascii="Arial" w:eastAsia="Times New Roman" w:hAnsi="Arial" w:cs="Arial"/>
-                <w:b/>
-                <w:bCs/>
-                <w:color w:val="1F1F1F"/>
-                <w:kern w:val="0"/>
-                <w:sz w:val="22"/>
-                <w:szCs w:val="22"/>
-                <w:bdr w:val="none" w:sz="0" w:space="0" w:color="auto" w:frame="1"/>
-                <w14:ligatures w14:val="none"/>
-              </w:rPr>
-              <w:t>must remain open</w:t>
-            </w:r>
-            <w:r>
-              <w:rPr>
-                <w:rFonts w:ascii="Arial" w:eastAsia="Times New Roman" w:hAnsi="Arial" w:cs="Arial"/>
-                <w:color w:val="1F1F1F"/>
-                <w:kern w:val="0"/>
-                <w:sz w:val="22"/>
-                <w:szCs w:val="22"/>
-                <w:bdr w:val="none" w:sz="0" w:space="0" w:color="auto" w:frame="1"/>
-                <w14:ligatures w14:val="none"/>
-              </w:rPr>
-              <w:t xml:space="preserve"> while you use Fastaptamer3</w:t>
-            </w:r>
-            <w:r>
-              <w:rPr>
-                <w:rFonts w:ascii="Arial" w:eastAsia="Times New Roman" w:hAnsi="Arial" w:cs="Arial"/>
-                <w:color w:val="444746"/>
-                <w:kern w:val="0"/>
-                <w:sz w:val="22"/>
-                <w:szCs w:val="22"/>
-                <w:bdr w:val="none" w:sz="0" w:space="0" w:color="auto" w:frame="1"/>
-                <w:vertAlign w:val="superscript"/>
-                <w14:ligatures w14:val="none"/>
-              </w:rPr>
-              <w:t>20</w:t>
-            </w:r>
-            <w:r>
-              <w:rPr>
-                <w:rFonts w:ascii="Arial" w:eastAsia="Times New Roman" w:hAnsi="Arial" w:cs="Arial"/>
-                <w:color w:val="1F1F1F"/>
-                <w:kern w:val="0"/>
-                <w:sz w:val="22"/>
-                <w:szCs w:val="22"/>
-                <w:bdr w:val="none" w:sz="0" w:space="0" w:color="auto" w:frame="1"/>
-                <w14:ligatures w14:val="none"/>
-              </w:rPr>
-              <w:t>.</w:t>
-            </w:r>
-          </w:p>
-        </w:tc>
-      </w:tr>
-      <w:tr>
-        <w:tc>
-          <w:tcPr>
-            <w:tcW w:w="0" w:type="auto"/>
-            <w:hideMark/>
-          </w:tcPr>
-          <w:p>
-            <w:pPr>
-              <w:rPr>
-                <w:rFonts w:ascii="Arial" w:eastAsia="Times New Roman" w:hAnsi="Arial" w:cs="Arial"/>
-                <w:color w:val="1F1F1F"/>
-                <w:kern w:val="0"/>
-                <w:sz w:val="22"/>
-                <w:szCs w:val="22"/>
-                <w14:ligatures w14:val="none"/>
-              </w:rPr>
-            </w:pPr>
-            <w:r>
-              <w:rPr>
-                <w:rFonts w:ascii="Arial" w:eastAsia="Times New Roman" w:hAnsi="Arial" w:cs="Arial"/>
-                <w:b/>
-                <w:bCs/>
-                <w:color w:val="1F1F1F"/>
-                <w:kern w:val="0"/>
-                <w:sz w:val="22"/>
-                <w:szCs w:val="22"/>
-                <w:bdr w:val="none" w:sz="0" w:space="0" w:color="auto" w:frame="1"/>
-                <w14:ligatures w14:val="none"/>
-              </w:rPr>
-              <w:t>Running Containers</w:t>
-            </w:r>
-            <w:r>
-              <w:rPr>
-                <w:rFonts w:ascii="Arial" w:eastAsia="Times New Roman" w:hAnsi="Arial" w:cs="Arial"/>
-                <w:color w:val="1F1F1F"/>
-                <w:kern w:val="0"/>
-                <w:sz w:val="22"/>
-                <w:szCs w:val="22"/>
-                <w:bdr w:val="none" w:sz="0" w:space="0" w:color="auto" w:frame="1"/>
-                <w14:ligatures w14:val="none"/>
-              </w:rPr>
-              <w:t xml:space="preserve"> (Verification)</w:t>
-            </w:r>
-          </w:p>
-        </w:tc>
-        <w:tc>
-          <w:tcPr>
-            <w:tcW w:w="0" w:type="auto"/>
-            <w:hideMark/>
-          </w:tcPr>
-          <w:p>
-            <w:pPr>
-              <w:rPr>
-                <w:rFonts w:ascii="Arial" w:eastAsia="Times New Roman" w:hAnsi="Arial" w:cs="Arial"/>
-                <w:color w:val="1F1F1F"/>
-                <w:kern w:val="0"/>
-                <w:sz w:val="22"/>
-                <w:szCs w:val="22"/>
-                <w14:ligatures w14:val="none"/>
-              </w:rPr>
-            </w:pPr>
+                <w:noProof/>
+                <w:color w:val="000000" w:themeColor="text1"/>
+              </w:rPr>
+              <w:drawing>
+                <wp:inline distT="0" distB="0" distL="0" distR="0" wp14:anchorId="15FC5D58" wp14:editId="2C9B06A3">
+                  <wp:extent cx="3467819" cy="1971025"/>
+                  <wp:effectExtent l="0" t="0" r="0" b="0"/>
+                  <wp:docPr id="1422869011" name="Picture 9" descr="A screenshot of a computer&#10;&#10;AI-generated content may be incorrect."/>
+                  <wp:cNvGraphicFramePr>
+                    <a:graphicFrameLocks xmlns:a="http://schemas.openxmlformats.org/drawingml/2006/main" noChangeAspect="1"/>
+                  </wp:cNvGraphicFramePr>
+                  <a:graphic xmlns:a="http://schemas.openxmlformats.org/drawingml/2006/main">
+                    <a:graphicData uri="http://schemas.openxmlformats.org/drawingml/2006/picture">
+                      <pic:pic xmlns:pic="http://schemas.openxmlformats.org/drawingml/2006/picture">
+                        <pic:nvPicPr>
+                          <pic:cNvPr id="1422869011" name="Picture 9" descr="A screenshot of a computer&#10;&#10;AI-generated content may be incorrect."/>
+                          <pic:cNvPicPr/>
+                        </pic:nvPicPr>
+                        <pic:blipFill>
+                          <a:blip r:embed="rId17" cstate="print">
+                            <a:extLst>
+                              <a:ext uri="{28A0092B-C50C-407E-A947-70E740481C1C}">
+                                <a14:useLocalDpi xmlns:a14="http://schemas.microsoft.com/office/drawing/2010/main" val="0"/>
+                              </a:ext>
+                            </a:extLst>
+                          </a:blip>
+                          <a:stretch>
+                            <a:fillRect/>
+                          </a:stretch>
+                        </pic:blipFill>
+                        <pic:spPr>
+                          <a:xfrm>
+                            <a:off x="0" y="0"/>
+                            <a:ext cx="3482076" cy="1979129"/>
+                          </a:xfrm>
+                          <a:prstGeom prst="rect">
+                            <a:avLst/>
+                          </a:prstGeom>
+                        </pic:spPr>
+                      </pic:pic>
+                    </a:graphicData>
+                  </a:graphic>
+                </wp:inline>
+              </w:drawing>
+            </w:r>
           </w:p>
         </w:tc>
         <w:tc>

</xml_diff>